<commit_message>
Fase 3 y actualizacion de documento en fase 1
</commit_message>
<xml_diff>
--- a/Trabajo Farmacia/01-diagnostico/Diagnostico_as-is.docx
+++ b/Trabajo Farmacia/01-diagnostico/Diagnostico_as-is.docx
@@ -2,10 +2,171 @@
 <file path=word/document.xml><?xml version="1.0" encoding="utf-8"?>
 <w:document xmlns:wpc="http://schemas.microsoft.com/office/word/2010/wordprocessingCanvas" xmlns:cx="http://schemas.microsoft.com/office/drawing/2014/chartex" xmlns:cx1="http://schemas.microsoft.com/office/drawing/2015/9/8/chartex" xmlns:cx2="http://schemas.microsoft.com/office/drawing/2015/10/21/chartex" xmlns:cx3="http://schemas.microsoft.com/office/drawing/2016/5/9/chartex" xmlns:cx4="http://schemas.microsoft.com/office/drawing/2016/5/10/chartex" xmlns:cx5="http://schemas.microsoft.com/office/drawing/2016/5/11/chartex" xmlns:cx6="http://schemas.microsoft.com/office/drawing/2016/5/12/chartex" xmlns:cx7="http://schemas.microsoft.com/office/drawing/2016/5/13/chartex" xmlns:cx8="http://schemas.microsoft.com/office/drawing/2016/5/14/chartex" xmlns:mc="http://schemas.openxmlformats.org/markup-compatibility/2006" xmlns:aink="http://schemas.microsoft.com/office/drawing/2016/ink" xmlns:am3d="http://schemas.microsoft.com/office/drawing/2017/model3d" xmlns:o="urn:schemas-microsoft-com:office:office" xmlns:r="http://schemas.openxmlformats.org/officeDocument/2006/relationships" xmlns:m="http://schemas.openxmlformats.org/officeDocument/2006/math" xmlns:v="urn:schemas-microsoft-com:vml" xmlns:wp14="http://schemas.microsoft.com/office/word/2010/wordprocessingDrawing" xmlns:wp="http://schemas.openxmlformats.org/drawingml/2006/wordprocessingDrawing" xmlns:w10="urn:schemas-microsoft-com:office:word" xmlns:w="http://schemas.openxmlformats.org/wordprocessingml/2006/main" xmlns:w14="http://schemas.microsoft.com/office/word/2010/wordml" xmlns:w15="http://schemas.microsoft.com/office/word/2012/wordml" xmlns:w16cex="http://schemas.microsoft.com/office/word/2018/wordml/cex" xmlns:w16cid="http://schemas.microsoft.com/office/word/2016/wordml/cid" xmlns:w16="http://schemas.microsoft.com/office/word/2018/wordml" xmlns:w16sdtdh="http://schemas.microsoft.com/office/word/2020/wordml/sdtdatahash" xmlns:w16se="http://schemas.microsoft.com/office/word/2015/wordml/symex" xmlns:wpg="http://schemas.microsoft.com/office/word/2010/wordprocessingGroup" xmlns:wpi="http://schemas.microsoft.com/office/word/2010/wordprocessingInk" xmlns:wne="http://schemas.microsoft.com/office/word/2006/wordml" xmlns:wps="http://schemas.microsoft.com/office/word/2010/wordprocessingShape" mc:Ignorable="w14 w15 w16se w16cid w16 w16cex w16sdtdh wp14">
   <w:body>
+    <w:p>
+      <w:pPr>
+        <w:jc w:val="center"/>
+      </w:pPr>
+      <w:r>
+        <w:rPr>
+          <w:b/>
+        </w:rPr>
+        <w:t>DIAGNÓSTICO AS-IS — SOLUCIONFARMACIA</w:t>
+      </w:r>
+    </w:p>
+    <w:p>
+      <w:pPr>
+        <w:jc w:val="center"/>
+      </w:pPr>
+      <w:r>
+        <w:t>Fase 1 del reto: Modernización arquitectónica de un sistema corporativo heredado</w:t>
+      </w:r>
+    </w:p>
+    <w:p>
+      <w:pPr>
+        <w:jc w:val="center"/>
+      </w:pPr>
+      <w:r>
+        <w:t>Curso: Arquitectura de Software · Entrega: /01-diagnostico · Fecha: 2026-08-06</w:t>
+      </w:r>
+    </w:p>
+    <w:p>
+      <w:r>
+        <w:rPr>
+          <w:b/>
+        </w:rPr>
+        <w:t>Roles del equipo (enunciado, seccion 2)</w:t>
+      </w:r>
+    </w:p>
+    <w:tbl>
+      <w:tblPr>
+        <w:tblW w:w="0" w:type="auto"/>
+        <w:tblLook w:val="04A0" w:firstRow="1" w:lastRow="0" w:firstColumn="1" w:lastColumn="0" w:noHBand="0" w:noVBand="1"/>
+      </w:tblPr>
+      <w:tblGrid>
+        <w:gridCol w:w="4680"/>
+        <w:gridCol w:w="4680"/>
+      </w:tblGrid>
+      <w:tr>
+        <w:tc>
+          <w:tcPr>
+            <w:tcW w:w="4680" w:type="dxa"/>
+          </w:tcPr>
+          <w:p>
+            <w:r>
+              <w:rPr>
+                <w:b/>
+              </w:rPr>
+              <w:t>Rol</w:t>
+            </w:r>
+          </w:p>
+        </w:tc>
+        <w:tc>
+          <w:tcPr>
+            <w:tcW w:w="4680" w:type="dxa"/>
+          </w:tcPr>
+          <w:p>
+            <w:r>
+              <w:rPr>
+                <w:b/>
+              </w:rPr>
+              <w:t>Integrante</w:t>
+            </w:r>
+          </w:p>
+        </w:tc>
+      </w:tr>
+      <w:tr>
+        <w:tc>
+          <w:tcPr>
+            <w:tcW w:w="4680" w:type="dxa"/>
+          </w:tcPr>
+          <w:p>
+            <w:r>
+              <w:t>Arquitecto de dominio</w:t>
+            </w:r>
+          </w:p>
+        </w:tc>
+        <w:tc>
+          <w:tcPr>
+            <w:tcW w:w="4680" w:type="dxa"/>
+          </w:tcPr>
+          <w:p>
+            <w:r>
+              <w:t>(completar)</w:t>
+            </w:r>
+          </w:p>
+        </w:tc>
+      </w:tr>
+      <w:tr>
+        <w:tc>
+          <w:tcPr>
+            <w:tcW w:w="4680" w:type="dxa"/>
+          </w:tcPr>
+          <w:p>
+            <w:r>
+              <w:t>Arquitecto de dependencias</w:t>
+            </w:r>
+          </w:p>
+        </w:tc>
+        <w:tc>
+          <w:tcPr>
+            <w:tcW w:w="4680" w:type="dxa"/>
+          </w:tcPr>
+          <w:p>
+            <w:r>
+              <w:t>(completar)</w:t>
+            </w:r>
+          </w:p>
+        </w:tc>
+      </w:tr>
+      <w:tr>
+        <w:tc>
+          <w:tcPr>
+            <w:tcW w:w="4680" w:type="dxa"/>
+          </w:tcPr>
+          <w:p>
+            <w:r>
+              <w:t>Ingeniero de comportamiento</w:t>
+            </w:r>
+          </w:p>
+        </w:tc>
+        <w:tc>
+          <w:tcPr>
+            <w:tcW w:w="4680" w:type="dxa"/>
+          </w:tcPr>
+          <w:p>
+            <w:r>
+              <w:t>(completar)</w:t>
+            </w:r>
+          </w:p>
+        </w:tc>
+      </w:tr>
+      <w:tr>
+        <w:tc>
+          <w:tcPr>
+            <w:tcW w:w="4680" w:type="dxa"/>
+          </w:tcPr>
+          <w:p>
+            <w:r>
+              <w:t>Integrador y evidencia</w:t>
+            </w:r>
+          </w:p>
+        </w:tc>
+        <w:tc>
+          <w:tcPr>
+            <w:tcW w:w="4680" w:type="dxa"/>
+          </w:tcPr>
+          <w:p>
+            <w:r>
+              <w:t>(completar)</w:t>
+            </w:r>
+          </w:p>
+        </w:tc>
+      </w:tr>
+    </w:tbl>
     <w:tbl>
       <w:tblPr>
         <w:tblpPr w:leftFromText="141" w:rightFromText="141" w:vertAnchor="text" w:horzAnchor="margin" w:tblpY="705"/>
-        <w:tblW w:w="4994" w:type="pct"/>
+        <w:tblW w:w="5000" w:type="pct"/>
         <w:tblBorders>
           <w:top w:val="single" w:sz="4" w:space="0" w:color="auto"/>
           <w:left w:val="single" w:sz="4" w:space="0" w:color="auto"/>
@@ -14,6 +175,7 @@
           <w:insideH w:val="single" w:sz="4" w:space="0" w:color="auto"/>
           <w:insideV w:val="single" w:sz="4" w:space="0" w:color="auto"/>
         </w:tblBorders>
+        <w:tblLayout w:type="fixed"/>
         <w:tblCellMar>
           <w:left w:w="70" w:type="dxa"/>
           <w:right w:w="70" w:type="dxa"/>
@@ -21,12 +183,12 @@
         <w:tblLook w:val="0000" w:firstRow="0" w:lastRow="0" w:firstColumn="0" w:lastColumn="0" w:noHBand="0" w:noVBand="0"/>
       </w:tblPr>
       <w:tblGrid>
-        <w:gridCol w:w="850"/>
-        <w:gridCol w:w="4279"/>
-        <w:gridCol w:w="2269"/>
-        <w:gridCol w:w="2272"/>
-        <w:gridCol w:w="2272"/>
-        <w:gridCol w:w="2171"/>
+        <w:gridCol w:w="702"/>
+        <w:gridCol w:w="3299"/>
+        <w:gridCol w:w="1563"/>
+        <w:gridCol w:w="1474"/>
+        <w:gridCol w:w="1373"/>
+        <w:gridCol w:w="939"/>
       </w:tblGrid>
       <w:tr>
         <w:trPr>
@@ -36,7 +198,7 @@
         </w:trPr>
         <w:tc>
           <w:tcPr>
-            <w:tcW w:w="301" w:type="pct"/>
+            <w:tcW w:w="375" w:type="pct"/>
             <w:shd w:val="clear" w:color="auto" w:fill="1F497D"/>
             <w:vAlign w:val="center"/>
           </w:tcPr>
@@ -61,7 +223,7 @@
         </w:tc>
         <w:tc>
           <w:tcPr>
-            <w:tcW w:w="1516" w:type="pct"/>
+            <w:tcW w:w="1764" w:type="pct"/>
             <w:shd w:val="clear" w:color="auto" w:fill="1F497D"/>
             <w:vAlign w:val="center"/>
           </w:tcPr>
@@ -86,7 +248,7 @@
         </w:tc>
         <w:tc>
           <w:tcPr>
-            <w:tcW w:w="804" w:type="pct"/>
+            <w:tcW w:w="836" w:type="pct"/>
             <w:shd w:val="clear" w:color="auto" w:fill="1F497D"/>
             <w:vAlign w:val="center"/>
           </w:tcPr>
@@ -111,7 +273,7 @@
         </w:tc>
         <w:tc>
           <w:tcPr>
-            <w:tcW w:w="805" w:type="pct"/>
+            <w:tcW w:w="788" w:type="pct"/>
             <w:shd w:val="clear" w:color="auto" w:fill="1F497D"/>
             <w:vAlign w:val="center"/>
           </w:tcPr>
@@ -136,7 +298,7 @@
         </w:tc>
         <w:tc>
           <w:tcPr>
-            <w:tcW w:w="805" w:type="pct"/>
+            <w:tcW w:w="734" w:type="pct"/>
             <w:shd w:val="clear" w:color="auto" w:fill="1F497D"/>
             <w:vAlign w:val="center"/>
           </w:tcPr>
@@ -161,7 +323,7 @@
         </w:tc>
         <w:tc>
           <w:tcPr>
-            <w:tcW w:w="769" w:type="pct"/>
+            <w:tcW w:w="502" w:type="pct"/>
             <w:shd w:val="clear" w:color="auto" w:fill="1F497D"/>
             <w:vAlign w:val="center"/>
           </w:tcPr>
@@ -192,7 +354,7 @@
         </w:trPr>
         <w:tc>
           <w:tcPr>
-            <w:tcW w:w="301" w:type="pct"/>
+            <w:tcW w:w="375" w:type="pct"/>
             <w:shd w:val="clear" w:color="auto" w:fill="auto"/>
             <w:vAlign w:val="center"/>
           </w:tcPr>
@@ -206,7 +368,6 @@
             </w:pPr>
             <w:r>
               <w:rPr>
-                <w:sz w:val="18"/>
                 <w:szCs w:val="18"/>
               </w:rPr>
               <w:t>H-01</w:t>
@@ -215,7 +376,7 @@
         </w:tc>
         <w:tc>
           <w:tcPr>
-            <w:tcW w:w="1516" w:type="pct"/>
+            <w:tcW w:w="1764" w:type="pct"/>
             <w:shd w:val="clear" w:color="auto" w:fill="auto"/>
             <w:vAlign w:val="center"/>
           </w:tcPr>
@@ -230,7 +391,6 @@
             <w:proofErr w:type="spellStart"/>
             <w:r>
               <w:rPr>
-                <w:sz w:val="18"/>
                 <w:szCs w:val="18"/>
               </w:rPr>
               <w:t>AppFarmaciaConsola</w:t>
@@ -238,7 +398,6 @@
             <w:proofErr w:type="spellEnd"/>
             <w:r>
               <w:rPr>
-                <w:sz w:val="18"/>
                 <w:szCs w:val="18"/>
               </w:rPr>
               <w:t>/</w:t>
@@ -246,7 +405,6 @@
             <w:proofErr w:type="spellStart"/>
             <w:r>
               <w:rPr>
-                <w:sz w:val="18"/>
                 <w:szCs w:val="18"/>
               </w:rPr>
               <w:t>Program.cs</w:t>
@@ -254,7 +412,6 @@
             <w:proofErr w:type="spellEnd"/>
             <w:r>
               <w:rPr>
-                <w:sz w:val="18"/>
                 <w:szCs w:val="18"/>
               </w:rPr>
               <w:t xml:space="preserve"> / flujo de venta / líneas 255-303, especialmente 280-292</w:t>
@@ -263,7 +420,7 @@
         </w:tc>
         <w:tc>
           <w:tcPr>
-            <w:tcW w:w="804" w:type="pct"/>
+            <w:tcW w:w="836" w:type="pct"/>
             <w:shd w:val="clear" w:color="auto" w:fill="auto"/>
             <w:vAlign w:val="center"/>
           </w:tcPr>
@@ -277,14 +434,12 @@
             </w:pPr>
             <w:r>
               <w:rPr>
-                <w:sz w:val="18"/>
                 <w:szCs w:val="18"/>
               </w:rPr>
               <w:t>La consola busca, el producto, modifica directamente stock, construye el movimiento y registra la venta</w:t>
             </w:r>
             <w:r>
               <w:rPr>
-                <w:sz w:val="18"/>
                 <w:szCs w:val="18"/>
               </w:rPr>
               <w:t>.</w:t>
@@ -300,16 +455,16 @@
             </w:pPr>
             <w:r>
               <w:rPr>
-                <w:sz w:val="18"/>
-                <w:szCs w:val="18"/>
-              </w:rPr>
+                <w:szCs w:val="18"/>
+              </w:rPr>
+              <w:lastRenderedPageBreak/>
               <w:t>Interfaz de Usuario y reglas de negocio están mezcladas</w:t>
             </w:r>
           </w:p>
         </w:tc>
         <w:tc>
           <w:tcPr>
-            <w:tcW w:w="805" w:type="pct"/>
+            <w:tcW w:w="788" w:type="pct"/>
             <w:shd w:val="clear" w:color="auto" w:fill="auto"/>
             <w:vAlign w:val="center"/>
           </w:tcPr>
@@ -323,16 +478,16 @@
             </w:pPr>
             <w:r>
               <w:rPr>
-                <w:sz w:val="18"/>
-                <w:szCs w:val="18"/>
-              </w:rPr>
+                <w:szCs w:val="18"/>
+              </w:rPr>
+              <w:lastRenderedPageBreak/>
               <w:t>SRP Principal</w:t>
             </w:r>
           </w:p>
         </w:tc>
         <w:tc>
           <w:tcPr>
-            <w:tcW w:w="805" w:type="pct"/>
+            <w:tcW w:w="734" w:type="pct"/>
             <w:shd w:val="clear" w:color="auto" w:fill="auto"/>
             <w:vAlign w:val="center"/>
           </w:tcPr>
@@ -346,7 +501,6 @@
             </w:pPr>
             <w:r>
               <w:rPr>
-                <w:sz w:val="18"/>
                 <w:szCs w:val="18"/>
               </w:rPr>
               <w:t xml:space="preserve">En </w:t>
@@ -354,7 +508,6 @@
             <w:proofErr w:type="spellStart"/>
             <w:r>
               <w:rPr>
-                <w:sz w:val="18"/>
                 <w:szCs w:val="18"/>
               </w:rPr>
               <w:t>Program</w:t>
@@ -362,16 +515,22 @@
             <w:proofErr w:type="spellEnd"/>
             <w:r>
               <w:rPr>
-                <w:sz w:val="18"/>
-                <w:szCs w:val="18"/>
-              </w:rPr>
-              <w:t xml:space="preserve"> se mezclan la interfaz de usuario y la regla de venta. Al quedar esa regla ligada a la consola, futuros canales podrían omitir pasos y generar diferencias entre inventario, ventas y cuadre de caja.</w:t>
-            </w:r>
-          </w:p>
-        </w:tc>
-        <w:tc>
-          <w:tcPr>
-            <w:tcW w:w="769" w:type="pct"/>
+                <w:szCs w:val="18"/>
+              </w:rPr>
+              <w:t xml:space="preserve"> se mezclan la interfaz de usuario y la regla de venta. Al quedar esa regla ligada a la consola, futuros </w:t>
+            </w:r>
+            <w:r>
+              <w:rPr>
+                <w:szCs w:val="18"/>
+              </w:rPr>
+              <w:lastRenderedPageBreak/>
+              <w:t>canales podrían omitir pasos y generar diferencias entre inventario, ventas y cuadre de caja.</w:t>
+            </w:r>
+          </w:p>
+        </w:tc>
+        <w:tc>
+          <w:tcPr>
+            <w:tcW w:w="502" w:type="pct"/>
             <w:shd w:val="clear" w:color="auto" w:fill="auto"/>
             <w:vAlign w:val="center"/>
           </w:tcPr>
@@ -385,14 +544,13 @@
             </w:pPr>
             <w:r>
               <w:rPr>
-                <w:sz w:val="18"/>
-                <w:szCs w:val="18"/>
-              </w:rPr>
+                <w:szCs w:val="18"/>
+              </w:rPr>
+              <w:lastRenderedPageBreak/>
               <w:t>Alta</w:t>
             </w:r>
             <w:r>
               <w:rPr>
-                <w:sz w:val="18"/>
                 <w:szCs w:val="18"/>
               </w:rPr>
               <w:t>: Propio</w:t>
@@ -407,7 +565,7 @@
         </w:trPr>
         <w:tc>
           <w:tcPr>
-            <w:tcW w:w="301" w:type="pct"/>
+            <w:tcW w:w="375" w:type="pct"/>
             <w:shd w:val="clear" w:color="auto" w:fill="auto"/>
             <w:vAlign w:val="center"/>
           </w:tcPr>
@@ -421,7 +579,6 @@
             </w:pPr>
             <w:r>
               <w:rPr>
-                <w:sz w:val="18"/>
                 <w:szCs w:val="18"/>
               </w:rPr>
               <w:t>H-02</w:t>
@@ -430,7 +587,7 @@
         </w:tc>
         <w:tc>
           <w:tcPr>
-            <w:tcW w:w="1516" w:type="pct"/>
+            <w:tcW w:w="1764" w:type="pct"/>
             <w:shd w:val="clear" w:color="auto" w:fill="auto"/>
             <w:vAlign w:val="center"/>
           </w:tcPr>
@@ -445,7 +602,6 @@
             <w:proofErr w:type="spellStart"/>
             <w:r>
               <w:rPr>
-                <w:sz w:val="18"/>
                 <w:szCs w:val="18"/>
               </w:rPr>
               <w:t>BibFarmacia</w:t>
@@ -453,7 +609,6 @@
             <w:proofErr w:type="spellEnd"/>
             <w:r>
               <w:rPr>
-                <w:sz w:val="18"/>
                 <w:szCs w:val="18"/>
               </w:rPr>
               <w:t>/Servicios/</w:t>
@@ -461,7 +616,6 @@
             <w:proofErr w:type="spellStart"/>
             <w:r>
               <w:rPr>
-                <w:sz w:val="18"/>
                 <w:szCs w:val="18"/>
               </w:rPr>
               <w:t>ServicioProducto.cs</w:t>
@@ -469,7 +623,6 @@
             <w:proofErr w:type="spellEnd"/>
             <w:r>
               <w:rPr>
-                <w:sz w:val="18"/>
                 <w:szCs w:val="18"/>
               </w:rPr>
               <w:t xml:space="preserve"> / </w:t>
@@ -477,7 +630,6 @@
             <w:proofErr w:type="spellStart"/>
             <w:r>
               <w:rPr>
-                <w:sz w:val="18"/>
                 <w:szCs w:val="18"/>
               </w:rPr>
               <w:t>CargarDesdeArchivo</w:t>
@@ -485,7 +637,6 @@
             <w:proofErr w:type="spellEnd"/>
             <w:r>
               <w:rPr>
-                <w:sz w:val="18"/>
                 <w:szCs w:val="18"/>
               </w:rPr>
               <w:t xml:space="preserve"> / líneas 75-118, especialmente 93-109</w:t>
@@ -494,7 +645,7 @@
         </w:tc>
         <w:tc>
           <w:tcPr>
-            <w:tcW w:w="804" w:type="pct"/>
+            <w:tcW w:w="836" w:type="pct"/>
             <w:shd w:val="clear" w:color="auto" w:fill="auto"/>
             <w:vAlign w:val="center"/>
           </w:tcPr>
@@ -508,15 +659,20 @@
             </w:pPr>
             <w:r>
               <w:rPr>
-                <w:sz w:val="18"/>
-                <w:szCs w:val="18"/>
-              </w:rPr>
-              <w:t xml:space="preserve">En el método todos los registros, solo se están cargando un tipo de medicamento y tipo de rellenos, pero si quiero cargar otro tipo de medicamentos tengo que modificar este método o el </w:t>
+                <w:szCs w:val="18"/>
+              </w:rPr>
+              <w:t xml:space="preserve">En el método todos los registros, solo se están cargando un tipo de medicamento y tipo de rellenos, pero si quiero cargar otro tipo de medicamentos </w:t>
+            </w:r>
+            <w:r>
+              <w:rPr>
+                <w:szCs w:val="18"/>
+              </w:rPr>
+              <w:lastRenderedPageBreak/>
+              <w:t xml:space="preserve">tengo que modificar este método o el </w:t>
             </w:r>
             <w:proofErr w:type="spellStart"/>
             <w:r>
               <w:rPr>
-                <w:sz w:val="18"/>
                 <w:szCs w:val="18"/>
               </w:rPr>
               <w:t>enum</w:t>
@@ -524,7 +680,6 @@
             <w:proofErr w:type="spellEnd"/>
             <w:r>
               <w:rPr>
-                <w:sz w:val="18"/>
                 <w:szCs w:val="18"/>
               </w:rPr>
               <w:t>.</w:t>
@@ -533,7 +688,7 @@
         </w:tc>
         <w:tc>
           <w:tcPr>
-            <w:tcW w:w="805" w:type="pct"/>
+            <w:tcW w:w="788" w:type="pct"/>
             <w:shd w:val="clear" w:color="auto" w:fill="auto"/>
             <w:vAlign w:val="center"/>
           </w:tcPr>
@@ -547,16 +702,16 @@
             </w:pPr>
             <w:r>
               <w:rPr>
-                <w:sz w:val="18"/>
-                <w:szCs w:val="18"/>
-              </w:rPr>
+                <w:szCs w:val="18"/>
+              </w:rPr>
+              <w:lastRenderedPageBreak/>
               <w:t>OCP Principal</w:t>
             </w:r>
           </w:p>
         </w:tc>
         <w:tc>
           <w:tcPr>
-            <w:tcW w:w="805" w:type="pct"/>
+            <w:tcW w:w="734" w:type="pct"/>
             <w:shd w:val="clear" w:color="auto" w:fill="auto"/>
             <w:vAlign w:val="center"/>
           </w:tcPr>
@@ -570,16 +725,22 @@
             </w:pPr>
             <w:r>
               <w:rPr>
-                <w:sz w:val="18"/>
-                <w:szCs w:val="18"/>
-              </w:rPr>
-              <w:t>El sistema no puede reconstruir correctamente todos los productos que su propio dominio admite. Agregar líquidos, tabletas o cremas puede provocar pérdida o interpretación incorrecta de información farmacéutica.</w:t>
-            </w:r>
-          </w:p>
-        </w:tc>
-        <w:tc>
-          <w:tcPr>
-            <w:tcW w:w="769" w:type="pct"/>
+                <w:szCs w:val="18"/>
+              </w:rPr>
+              <w:t xml:space="preserve">El sistema no puede reconstruir correctamente todos los productos que su propio dominio admite. Agregar líquidos, tabletas o </w:t>
+            </w:r>
+            <w:r>
+              <w:rPr>
+                <w:szCs w:val="18"/>
+              </w:rPr>
+              <w:lastRenderedPageBreak/>
+              <w:t>cremas puede provocar pérdida o interpretación incorrecta de información farmacéutica.</w:t>
+            </w:r>
+          </w:p>
+        </w:tc>
+        <w:tc>
+          <w:tcPr>
+            <w:tcW w:w="502" w:type="pct"/>
             <w:shd w:val="clear" w:color="auto" w:fill="auto"/>
             <w:vAlign w:val="center"/>
           </w:tcPr>
@@ -593,9 +754,9 @@
             </w:pPr>
             <w:r>
               <w:rPr>
-                <w:sz w:val="18"/>
-                <w:szCs w:val="18"/>
-              </w:rPr>
+                <w:szCs w:val="18"/>
+              </w:rPr>
+              <w:lastRenderedPageBreak/>
               <w:t>Alta: Propio</w:t>
             </w:r>
           </w:p>
@@ -608,7 +769,7 @@
         </w:trPr>
         <w:tc>
           <w:tcPr>
-            <w:tcW w:w="301" w:type="pct"/>
+            <w:tcW w:w="375" w:type="pct"/>
             <w:shd w:val="clear" w:color="auto" w:fill="auto"/>
             <w:vAlign w:val="center"/>
           </w:tcPr>
@@ -622,7 +783,6 @@
             </w:pPr>
             <w:r>
               <w:rPr>
-                <w:sz w:val="18"/>
                 <w:szCs w:val="18"/>
               </w:rPr>
               <w:t>H-03</w:t>
@@ -631,7 +791,7 @@
         </w:tc>
         <w:tc>
           <w:tcPr>
-            <w:tcW w:w="1516" w:type="pct"/>
+            <w:tcW w:w="1764" w:type="pct"/>
             <w:shd w:val="clear" w:color="auto" w:fill="auto"/>
             <w:vAlign w:val="center"/>
           </w:tcPr>
@@ -646,7 +806,6 @@
             <w:proofErr w:type="spellStart"/>
             <w:r>
               <w:rPr>
-                <w:sz w:val="18"/>
                 <w:szCs w:val="18"/>
               </w:rPr>
               <w:t>BibFarmacia</w:t>
@@ -654,7 +813,6 @@
             <w:proofErr w:type="spellEnd"/>
             <w:r>
               <w:rPr>
-                <w:sz w:val="18"/>
                 <w:szCs w:val="18"/>
               </w:rPr>
               <w:t>/Servicios/</w:t>
@@ -662,7 +820,6 @@
             <w:proofErr w:type="spellStart"/>
             <w:r>
               <w:rPr>
-                <w:sz w:val="18"/>
                 <w:szCs w:val="18"/>
               </w:rPr>
               <w:t>ServicioCliente.cs</w:t>
@@ -670,7 +827,6 @@
             <w:proofErr w:type="spellEnd"/>
             <w:r>
               <w:rPr>
-                <w:sz w:val="18"/>
                 <w:szCs w:val="18"/>
               </w:rPr>
               <w:t xml:space="preserve"> / </w:t>
@@ -678,7 +834,6 @@
             <w:proofErr w:type="spellStart"/>
             <w:r>
               <w:rPr>
-                <w:sz w:val="18"/>
                 <w:szCs w:val="18"/>
               </w:rPr>
               <w:t>ServicioCliente</w:t>
@@ -686,7 +841,6 @@
             <w:proofErr w:type="spellEnd"/>
             <w:r>
               <w:rPr>
-                <w:sz w:val="18"/>
                 <w:szCs w:val="18"/>
               </w:rPr>
               <w:t xml:space="preserve"> / líneas 14-80</w:t>
@@ -695,7 +849,7 @@
         </w:tc>
         <w:tc>
           <w:tcPr>
-            <w:tcW w:w="804" w:type="pct"/>
+            <w:tcW w:w="836" w:type="pct"/>
             <w:shd w:val="clear" w:color="auto" w:fill="auto"/>
             <w:vAlign w:val="center"/>
           </w:tcPr>
@@ -709,28 +863,24 @@
             </w:pPr>
             <w:r>
               <w:rPr>
-                <w:sz w:val="18"/>
                 <w:szCs w:val="18"/>
               </w:rPr>
               <w:t xml:space="preserve">La clase maneja Clientes, Acumula </w:t>
             </w:r>
             <w:r>
               <w:rPr>
-                <w:sz w:val="18"/>
                 <w:szCs w:val="18"/>
               </w:rPr>
               <w:t>puntos y</w:t>
             </w:r>
             <w:r>
               <w:rPr>
-                <w:sz w:val="18"/>
                 <w:szCs w:val="18"/>
               </w:rPr>
               <w:t xml:space="preserve"> carga</w:t>
             </w:r>
             <w:r>
               <w:rPr>
-                <w:sz w:val="18"/>
                 <w:szCs w:val="18"/>
               </w:rPr>
               <w:t xml:space="preserve"> clientes.</w:t>
@@ -746,16 +896,27 @@
             </w:pPr>
             <w:r>
               <w:rPr>
-                <w:sz w:val="18"/>
-                <w:szCs w:val="18"/>
-              </w:rPr>
-              <w:t>Hay 3 responsabilidades diferentes</w:t>
-            </w:r>
-          </w:p>
-        </w:tc>
-        <w:tc>
-          <w:tcPr>
-            <w:tcW w:w="805" w:type="pct"/>
+                <w:szCs w:val="18"/>
+              </w:rPr>
+              <w:t xml:space="preserve">Hay </w:t>
+            </w:r>
+            <w:r>
+              <w:rPr>
+                <w:szCs w:val="18"/>
+              </w:rPr>
+              <w:t>2</w:t>
+            </w:r>
+            <w:r>
+              <w:rPr>
+                <w:szCs w:val="18"/>
+              </w:rPr>
+              <w:t xml:space="preserve"> responsabilidades diferentes</w:t>
+            </w:r>
+          </w:p>
+        </w:tc>
+        <w:tc>
+          <w:tcPr>
+            <w:tcW w:w="788" w:type="pct"/>
             <w:shd w:val="clear" w:color="auto" w:fill="auto"/>
             <w:vAlign w:val="center"/>
           </w:tcPr>
@@ -769,7 +930,6 @@
             </w:pPr>
             <w:r>
               <w:rPr>
-                <w:sz w:val="18"/>
                 <w:szCs w:val="18"/>
               </w:rPr>
               <w:t>SRP Principal</w:t>
@@ -778,7 +938,7 @@
         </w:tc>
         <w:tc>
           <w:tcPr>
-            <w:tcW w:w="805" w:type="pct"/>
+            <w:tcW w:w="734" w:type="pct"/>
             <w:shd w:val="clear" w:color="auto" w:fill="auto"/>
             <w:vAlign w:val="center"/>
           </w:tcPr>
@@ -792,14 +952,19 @@
             </w:pPr>
             <w:r>
               <w:rPr>
-                <w:sz w:val="18"/>
-                <w:szCs w:val="18"/>
-              </w:rPr>
-              <w:t xml:space="preserve">Como varias funcionalidades distintas están concentradas en una sola clase, cualquier modificación obliga a revisar y probar más comportamiento del necesario, aumentando el tiempo de mantenimiento y el riesgo de </w:t>
-            </w:r>
-            <w:r>
-              <w:rPr>
-                <w:sz w:val="18"/>
+                <w:szCs w:val="18"/>
+              </w:rPr>
+              <w:t>Como varias funcionalidades distintas están concentradas en una sola clase, cualquier modificación obliga a revisar y probar más comportami</w:t>
+            </w:r>
+            <w:r>
+              <w:rPr>
+                <w:szCs w:val="18"/>
+              </w:rPr>
+              <w:lastRenderedPageBreak/>
+              <w:t xml:space="preserve">ento del necesario, aumentando el tiempo de mantenimiento y el riesgo de </w:t>
+            </w:r>
+            <w:r>
+              <w:rPr>
                 <w:szCs w:val="18"/>
               </w:rPr>
               <w:t>regresiones.</w:t>
@@ -808,7 +973,7 @@
         </w:tc>
         <w:tc>
           <w:tcPr>
-            <w:tcW w:w="769" w:type="pct"/>
+            <w:tcW w:w="502" w:type="pct"/>
             <w:shd w:val="clear" w:color="auto" w:fill="auto"/>
             <w:vAlign w:val="center"/>
           </w:tcPr>
@@ -822,9 +987,9 @@
             </w:pPr>
             <w:r>
               <w:rPr>
-                <w:sz w:val="18"/>
-                <w:szCs w:val="18"/>
-              </w:rPr>
+                <w:szCs w:val="18"/>
+              </w:rPr>
+              <w:lastRenderedPageBreak/>
               <w:t>Media: Propio</w:t>
             </w:r>
           </w:p>
@@ -837,7 +1002,7 @@
         </w:trPr>
         <w:tc>
           <w:tcPr>
-            <w:tcW w:w="301" w:type="pct"/>
+            <w:tcW w:w="375" w:type="pct"/>
             <w:shd w:val="clear" w:color="auto" w:fill="auto"/>
             <w:vAlign w:val="center"/>
           </w:tcPr>
@@ -851,7 +1016,6 @@
             </w:pPr>
             <w:r>
               <w:rPr>
-                <w:sz w:val="18"/>
                 <w:szCs w:val="18"/>
               </w:rPr>
               <w:t>H-04</w:t>
@@ -860,7 +1024,7 @@
         </w:tc>
         <w:tc>
           <w:tcPr>
-            <w:tcW w:w="1516" w:type="pct"/>
+            <w:tcW w:w="1764" w:type="pct"/>
             <w:shd w:val="clear" w:color="auto" w:fill="auto"/>
             <w:vAlign w:val="center"/>
           </w:tcPr>
@@ -875,7 +1039,6 @@
             <w:proofErr w:type="spellStart"/>
             <w:r>
               <w:rPr>
-                <w:sz w:val="18"/>
                 <w:szCs w:val="18"/>
               </w:rPr>
               <w:t>ServicioProducto.CargarDesdeArchivo</w:t>
@@ -883,7 +1046,6 @@
             <w:proofErr w:type="spellEnd"/>
             <w:r>
               <w:rPr>
-                <w:sz w:val="18"/>
                 <w:szCs w:val="18"/>
               </w:rPr>
               <w:t xml:space="preserve">, líneas 75-118; </w:t>
@@ -891,7 +1053,6 @@
             <w:proofErr w:type="spellStart"/>
             <w:r>
               <w:rPr>
-                <w:sz w:val="18"/>
                 <w:szCs w:val="18"/>
               </w:rPr>
               <w:t>ServicioCliente.Cargar</w:t>
@@ -899,7 +1060,6 @@
             <w:proofErr w:type="spellEnd"/>
             <w:r>
               <w:rPr>
-                <w:sz w:val="18"/>
                 <w:szCs w:val="18"/>
               </w:rPr>
               <w:t xml:space="preserve">, líneas 47-81; </w:t>
@@ -907,7 +1067,6 @@
             <w:proofErr w:type="spellStart"/>
             <w:r>
               <w:rPr>
-                <w:sz w:val="18"/>
                 <w:szCs w:val="18"/>
               </w:rPr>
               <w:t>ServicioUsuario.Cargar</w:t>
@@ -915,7 +1074,6 @@
             <w:proofErr w:type="spellEnd"/>
             <w:r>
               <w:rPr>
-                <w:sz w:val="18"/>
                 <w:szCs w:val="18"/>
               </w:rPr>
               <w:t>, líneas 37-73</w:t>
@@ -924,7 +1082,7 @@
         </w:tc>
         <w:tc>
           <w:tcPr>
-            <w:tcW w:w="804" w:type="pct"/>
+            <w:tcW w:w="836" w:type="pct"/>
             <w:shd w:val="clear" w:color="auto" w:fill="auto"/>
             <w:vAlign w:val="center"/>
           </w:tcPr>
@@ -938,7 +1096,6 @@
             </w:pPr>
             <w:r>
               <w:rPr>
-                <w:sz w:val="18"/>
                 <w:szCs w:val="18"/>
               </w:rPr>
               <w:t xml:space="preserve">Los </w:t>
@@ -946,7 +1103,6 @@
             <w:proofErr w:type="spellStart"/>
             <w:r>
               <w:rPr>
-                <w:sz w:val="18"/>
                 <w:szCs w:val="18"/>
               </w:rPr>
               <w:t>Modulos</w:t>
@@ -954,14 +1110,12 @@
             <w:proofErr w:type="spellEnd"/>
             <w:r>
               <w:rPr>
-                <w:sz w:val="18"/>
                 <w:szCs w:val="18"/>
               </w:rPr>
               <w:t xml:space="preserve"> de alto nivel que serian los servicios dependen de que los archivos lo lea FIL</w:t>
             </w:r>
             <w:r>
               <w:rPr>
-                <w:sz w:val="18"/>
                 <w:szCs w:val="18"/>
               </w:rPr>
               <w:t xml:space="preserve">E y </w:t>
@@ -969,7 +1123,6 @@
             <w:proofErr w:type="spellStart"/>
             <w:r>
               <w:rPr>
-                <w:sz w:val="18"/>
                 <w:szCs w:val="18"/>
               </w:rPr>
               <w:t>esten</w:t>
@@ -977,7 +1130,6 @@
             <w:proofErr w:type="spellEnd"/>
             <w:r>
               <w:rPr>
-                <w:sz w:val="18"/>
                 <w:szCs w:val="18"/>
               </w:rPr>
               <w:t xml:space="preserve"> delimitados </w:t>
@@ -985,7 +1137,6 @@
             <w:proofErr w:type="gramStart"/>
             <w:r>
               <w:rPr>
-                <w:sz w:val="18"/>
                 <w:szCs w:val="18"/>
               </w:rPr>
               <w:t>por ;</w:t>
@@ -995,7 +1146,7 @@
         </w:tc>
         <w:tc>
           <w:tcPr>
-            <w:tcW w:w="805" w:type="pct"/>
+            <w:tcW w:w="788" w:type="pct"/>
             <w:shd w:val="clear" w:color="auto" w:fill="auto"/>
             <w:vAlign w:val="center"/>
           </w:tcPr>
@@ -1009,7 +1160,6 @@
             </w:pPr>
             <w:r>
               <w:rPr>
-                <w:sz w:val="18"/>
                 <w:szCs w:val="18"/>
               </w:rPr>
               <w:t>DIP Principal</w:t>
@@ -1018,7 +1168,7 @@
         </w:tc>
         <w:tc>
           <w:tcPr>
-            <w:tcW w:w="805" w:type="pct"/>
+            <w:tcW w:w="734" w:type="pct"/>
             <w:shd w:val="clear" w:color="auto" w:fill="auto"/>
             <w:vAlign w:val="center"/>
           </w:tcPr>
@@ -1031,14 +1181,19 @@
             </w:pPr>
             <w:r>
               <w:rPr>
-                <w:sz w:val="18"/>
-                <w:szCs w:val="18"/>
-              </w:rPr>
-              <w:t>Cambiar TXT por SQL, JSON o una API exige modificar servicios críticos. Un cambio de columnas puede afectar catálogo, clientes y autenticación simultáneamente</w:t>
-            </w:r>
-            <w:r>
-              <w:rPr>
-                <w:sz w:val="18"/>
+                <w:szCs w:val="18"/>
+              </w:rPr>
+              <w:t>Cambiar TXT por SQL, JSON o una API exige modificar servicios críticos. Un cambio de columnas puede afectar catálogo, clientes y autenticació</w:t>
+            </w:r>
+            <w:r>
+              <w:rPr>
+                <w:szCs w:val="18"/>
+              </w:rPr>
+              <w:lastRenderedPageBreak/>
+              <w:t>n simultáneamente</w:t>
+            </w:r>
+            <w:r>
+              <w:rPr>
                 <w:szCs w:val="18"/>
               </w:rPr>
               <w:br/>
@@ -1048,7 +1203,7 @@
         </w:tc>
         <w:tc>
           <w:tcPr>
-            <w:tcW w:w="769" w:type="pct"/>
+            <w:tcW w:w="502" w:type="pct"/>
             <w:shd w:val="clear" w:color="auto" w:fill="auto"/>
             <w:vAlign w:val="center"/>
           </w:tcPr>
@@ -1062,10 +1217,180 @@
             </w:pPr>
             <w:r>
               <w:rPr>
+                <w:szCs w:val="18"/>
+              </w:rPr>
+              <w:lastRenderedPageBreak/>
+              <w:t>Alta: Propio</w:t>
+            </w:r>
+          </w:p>
+        </w:tc>
+      </w:tr>
+      <w:tr>
+        <w:trPr>
+          <w:cantSplit/>
+          <w:trHeight w:val="1343"/>
+        </w:trPr>
+        <w:tc>
+          <w:tcPr>
+            <w:tcW w:w="375" w:type="pct"/>
+            <w:shd w:val="clear" w:color="auto" w:fill="auto"/>
+            <w:vAlign w:val="center"/>
+          </w:tcPr>
+          <w:p>
+            <w:pPr>
+              <w:rPr>
                 <w:sz w:val="18"/>
                 <w:szCs w:val="18"/>
               </w:rPr>
-              <w:t>Alta: Propio</w:t>
+            </w:pPr>
+            <w:r>
+              <w:rPr>
+                <w:szCs w:val="18"/>
+              </w:rPr>
+              <w:t>H-05</w:t>
+            </w:r>
+          </w:p>
+        </w:tc>
+        <w:tc>
+          <w:tcPr>
+            <w:tcW w:w="1764" w:type="pct"/>
+            <w:shd w:val="clear" w:color="auto" w:fill="auto"/>
+            <w:vAlign w:val="center"/>
+          </w:tcPr>
+          <w:p>
+            <w:proofErr w:type="spellStart"/>
+            <w:r>
+              <w:t>BibFarmacia</w:t>
+            </w:r>
+            <w:proofErr w:type="spellEnd"/>
+            <w:r>
+              <w:t>/Servicios/</w:t>
+            </w:r>
+            <w:proofErr w:type="spellStart"/>
+            <w:r>
+              <w:t>ServicioProducto.cs</w:t>
+            </w:r>
+            <w:proofErr w:type="spellEnd"/>
+          </w:p>
+          <w:p>
+            <w:pPr>
+              <w:rPr>
+                <w:sz w:val="18"/>
+                <w:szCs w:val="18"/>
+              </w:rPr>
+            </w:pPr>
+            <w:r>
+              <w:t>Líneas 27-120</w:t>
+            </w:r>
+          </w:p>
+        </w:tc>
+        <w:tc>
+          <w:tcPr>
+            <w:tcW w:w="836" w:type="pct"/>
+            <w:shd w:val="clear" w:color="auto" w:fill="auto"/>
+            <w:vAlign w:val="center"/>
+          </w:tcPr>
+          <w:p>
+            <w:pPr>
+              <w:rPr>
+                <w:sz w:val="18"/>
+                <w:szCs w:val="18"/>
+              </w:rPr>
+            </w:pPr>
+            <w:proofErr w:type="spellStart"/>
+            <w:r>
+              <w:rPr>
+                <w:szCs w:val="18"/>
+              </w:rPr>
+              <w:t>ServicioProducto</w:t>
+            </w:r>
+            <w:proofErr w:type="spellEnd"/>
+            <w:r>
+              <w:rPr>
+                <w:szCs w:val="18"/>
+              </w:rPr>
+              <w:t xml:space="preserve"> concentra la administración de la colección de productos y la evaluación de condiciones de stock y vencimiento para generar alertas. Estas funciones responden a motivos de </w:t>
+            </w:r>
+            <w:r>
+              <w:rPr>
+                <w:szCs w:val="18"/>
+              </w:rPr>
+              <w:lastRenderedPageBreak/>
+              <w:t xml:space="preserve">cambio </w:t>
+            </w:r>
+            <w:proofErr w:type="spellStart"/>
+            <w:r>
+              <w:rPr>
+                <w:szCs w:val="18"/>
+              </w:rPr>
+              <w:t>diferent</w:t>
+            </w:r>
+            <w:proofErr w:type="spellEnd"/>
+          </w:p>
+        </w:tc>
+        <w:tc>
+          <w:tcPr>
+            <w:tcW w:w="788" w:type="pct"/>
+            <w:shd w:val="clear" w:color="auto" w:fill="auto"/>
+            <w:vAlign w:val="center"/>
+          </w:tcPr>
+          <w:p>
+            <w:pPr>
+              <w:rPr>
+                <w:sz w:val="18"/>
+                <w:szCs w:val="18"/>
+              </w:rPr>
+            </w:pPr>
+            <w:r>
+              <w:rPr>
+                <w:szCs w:val="18"/>
+              </w:rPr>
+              <w:lastRenderedPageBreak/>
+              <w:t>SRP Principal</w:t>
+            </w:r>
+          </w:p>
+        </w:tc>
+        <w:tc>
+          <w:tcPr>
+            <w:tcW w:w="734" w:type="pct"/>
+            <w:shd w:val="clear" w:color="auto" w:fill="auto"/>
+            <w:vAlign w:val="center"/>
+          </w:tcPr>
+          <w:p>
+            <w:pPr>
+              <w:rPr>
+                <w:sz w:val="18"/>
+                <w:szCs w:val="18"/>
+              </w:rPr>
+            </w:pPr>
+            <w:r>
+              <w:t xml:space="preserve">Los cambios en las políticas de alertas de inventario o vencimiento obligan a modificar y volver a probar una clase que también administra los productos, aumentando el alcance </w:t>
+            </w:r>
+            <w:r>
+              <w:lastRenderedPageBreak/>
+              <w:t>de mantenimiento y el riesgo de regresiones.</w:t>
+            </w:r>
+          </w:p>
+        </w:tc>
+        <w:tc>
+          <w:tcPr>
+            <w:tcW w:w="502" w:type="pct"/>
+            <w:shd w:val="clear" w:color="auto" w:fill="auto"/>
+            <w:vAlign w:val="center"/>
+          </w:tcPr>
+          <w:p>
+            <w:pPr>
+              <w:rPr>
+                <w:sz w:val="18"/>
+                <w:szCs w:val="18"/>
+              </w:rPr>
+            </w:pPr>
+            <w:r>
+              <w:rPr>
+                <w:szCs w:val="18"/>
+              </w:rPr>
+              <w:lastRenderedPageBreak/>
+              <w:t>Media: Propio</w:t>
             </w:r>
           </w:p>
         </w:tc>
@@ -1073,224 +1398,280 @@
     </w:tbl>
     <w:p>
       <w:pPr>
-        <w:ind w:firstLine="708"/>
         <w:jc w:val="center"/>
         <w:rPr>
           <w:b/>
           <w:bCs/>
         </w:rPr>
       </w:pPr>
-      <w:r>
+    </w:p>
+    <w:p>
+      <w:pPr>
+        <w:jc w:val="center"/>
         <w:rPr>
           <w:b/>
           <w:bCs/>
         </w:rPr>
-        <w:t>Hallazgos Arquitectura De Softwares</w:t>
-      </w:r>
-    </w:p>
-    <w:p>
-      <w:pPr>
-        <w:jc w:val="center"/>
+      </w:pPr>
+      <w:r>
         <w:rPr>
           <w:b/>
           <w:bCs/>
         </w:rPr>
-      </w:pPr>
-      <w:r>
+        <w:t>Hallazgos Arquitectura De Softwares</w:t>
+      </w:r>
+    </w:p>
+    <w:p>
+      <w:r>
+        <w:rPr>
+          <w:b/>
+        </w:rPr>
+        <w:t>Entregable de esta fase (diagrama UML AS-IS):</w:t>
+      </w:r>
+    </w:p>
+    <w:p>
+      <w:pPr>
+        <w:ind w:firstLine="720"/>
+      </w:pPr>
+      <w:r>
+        <w:t>Diagrama UML del estado actual en notacion extendida, reconstruido a partir del codigo fuente: archivo FASE1.dia Contiene las 27 clases reales con sus atributos y operaciones, y las 36 relaciones con multiplicidades (5 herencias, 2 realizaciones, 6 composiciones, 4 agregaciones, 19 dependencias), mas las notas de hallazgos H-01-H-05. No es un diagrama idealizado: refleja exactamente lo que esta escrito en el codigo.</w:t>
+      </w:r>
+    </w:p>
+    <w:p>
+      <w:pPr>
         <w:rPr>
           <w:b/>
           <w:bCs/>
         </w:rPr>
-        <w:lastRenderedPageBreak/>
-        <w:t>Refutada</w:t>
-      </w:r>
-    </w:p>
-    <w:p>
-      <w:r>
-        <w:t xml:space="preserve">R-01 — Sugerencia del agente “Arquitectura” (GitHub </w:t>
-      </w:r>
-      <w:proofErr w:type="spellStart"/>
-      <w:r>
-        <w:t>Copilot</w:t>
-      </w:r>
-      <w:proofErr w:type="spellEnd"/>
-      <w:r>
-        <w:t xml:space="preserve"> en VS </w:t>
-      </w:r>
-      <w:proofErr w:type="spellStart"/>
-      <w:r>
-        <w:t>Code</w:t>
-      </w:r>
-      <w:proofErr w:type="spellEnd"/>
-      <w:r>
-        <w:t>)</w:t>
-      </w:r>
-    </w:p>
-    <w:p>
-      <w:r>
-        <w:t xml:space="preserve">Sugerencia: utilizar </w:t>
-      </w:r>
-      <w:proofErr w:type="spellStart"/>
-      <w:r>
-        <w:t>ProductoFactory</w:t>
-      </w:r>
-      <w:proofErr w:type="spellEnd"/>
-      <w:r>
-        <w:t xml:space="preserve"> dentro de </w:t>
-      </w:r>
-      <w:proofErr w:type="spellStart"/>
-      <w:r>
-        <w:t>ServicioProducto.CargarDesdeArchivo</w:t>
-      </w:r>
-      <w:proofErr w:type="spellEnd"/>
-      <w:r>
-        <w:t xml:space="preserve"> para centralizar la creación de productos.</w:t>
-      </w:r>
-    </w:p>
-    <w:p>
-      <w:pPr>
+      </w:pPr>
+      <w:r>
         <w:rPr>
           <w:b/>
           <w:bCs/>
         </w:rPr>
-      </w:pPr>
-      <w:r>
+        <w:t>Refutada</w:t>
+      </w:r>
+    </w:p>
+    <w:p>
+      <w:r>
+        <w:rPr>
+          <w:b/>
+        </w:rPr>
+        <w:t xml:space="preserve">R-01 — Sugerencia del agente “Arquitectura” (GitHub </w:t>
+      </w:r>
+      <w:proofErr w:type="spellStart"/>
+      <w:r>
+        <w:rPr>
+          <w:b/>
+        </w:rPr>
+        <w:t>Copilot</w:t>
+      </w:r>
+      <w:proofErr w:type="spellEnd"/>
+      <w:r>
+        <w:rPr>
+          <w:b/>
+        </w:rPr>
+        <w:t xml:space="preserve"> en VS </w:t>
+      </w:r>
+      <w:proofErr w:type="spellStart"/>
+      <w:r>
+        <w:rPr>
+          <w:b/>
+        </w:rPr>
+        <w:t>Code</w:t>
+      </w:r>
+      <w:proofErr w:type="spellEnd"/>
+      <w:r>
+        <w:rPr>
+          <w:b/>
+        </w:rPr>
+        <w:t>)</w:t>
+      </w:r>
+    </w:p>
+    <w:p>
+      <w:pPr>
+        <w:ind w:firstLine="720"/>
+      </w:pPr>
+      <w:r>
+        <w:t xml:space="preserve">Sugerencia: utilizar </w:t>
+      </w:r>
+      <w:proofErr w:type="spellStart"/>
+      <w:r>
+        <w:t>ProductoFactory</w:t>
+      </w:r>
+      <w:proofErr w:type="spellEnd"/>
+      <w:r>
+        <w:t xml:space="preserve"> dentro de </w:t>
+      </w:r>
+      <w:proofErr w:type="spellStart"/>
+      <w:r>
+        <w:t>ServicioProducto.CargarDesdeArchivo</w:t>
+      </w:r>
+      <w:proofErr w:type="spellEnd"/>
+      <w:r>
+        <w:t xml:space="preserve"> para centralizar la creación de productos.</w:t>
+      </w:r>
+    </w:p>
+    <w:p>
+      <w:pPr>
         <w:rPr>
           <w:b/>
           <w:bCs/>
         </w:rPr>
-        <w:t>Veredicto: RECHAZADA en el AS-IS.</w:t>
-      </w:r>
-    </w:p>
-    <w:p>
-      <w:r>
-        <w:t xml:space="preserve">La propuesta se rechaza tal como fue planteada porque sustituir la construcción actual por </w:t>
-      </w:r>
-      <w:proofErr w:type="spellStart"/>
-      <w:r>
-        <w:t>ProductoFactory.CrearCapsula</w:t>
-      </w:r>
-      <w:proofErr w:type="spellEnd"/>
-      <w:r>
-        <w:t xml:space="preserve">() modificaría valores utilizados por el comportamiento existente. Actualmente, </w:t>
-      </w:r>
-      <w:proofErr w:type="spellStart"/>
-      <w:r>
-        <w:t>CargarDesdeArchivo</w:t>
-      </w:r>
-      <w:proofErr w:type="spellEnd"/>
-      <w:r>
-        <w:t xml:space="preserve"> obtiene el stock mínimo y la fecha de vencimiento directamente del archivo, mientras que la </w:t>
-      </w:r>
-      <w:proofErr w:type="spellStart"/>
-      <w:r>
-        <w:t>factory</w:t>
-      </w:r>
-      <w:proofErr w:type="spellEnd"/>
-      <w:r>
-        <w:t xml:space="preserve"> asigna valores predeterminados.</w:t>
-      </w:r>
-    </w:p>
-    <w:p>
-      <w:pPr>
-        <w:rPr>
-          <w:lang w:val="es-419"/>
-        </w:rPr>
-      </w:pPr>
-      <w:r>
-        <w:rPr>
-          <w:lang w:val="es-419"/>
-        </w:rPr>
-        <w:t xml:space="preserve">Si se reemplazara la creación directa por la </w:t>
-      </w:r>
-      <w:proofErr w:type="spellStart"/>
-      <w:r>
-        <w:rPr>
-          <w:lang w:val="es-419"/>
-        </w:rPr>
-        <w:t>factory</w:t>
-      </w:r>
-      <w:proofErr w:type="spellEnd"/>
-      <w:r>
-        <w:rPr>
-          <w:lang w:val="es-419"/>
-        </w:rPr>
-        <w:t>, los productos cargados tendrían stock mínimo y fecha de vencimiento distintos a los del archivo → las alertas de stock y vencimiento cambiarían de comportamiento → se viola la restricción dura (sección 1 del enunciado).</w:t>
-      </w:r>
-    </w:p>
-    <w:p>
-      <w:pPr>
-        <w:rPr>
-          <w:lang w:val="es-419"/>
-        </w:rPr>
-      </w:pPr>
-      <w:r>
-        <w:rPr>
-          <w:lang w:val="es-419"/>
-        </w:rPr>
-        <w:t xml:space="preserve">Además, la </w:t>
-      </w:r>
-      <w:proofErr w:type="spellStart"/>
-      <w:r>
-        <w:rPr>
-          <w:lang w:val="es-419"/>
-        </w:rPr>
-        <w:t>factory</w:t>
-      </w:r>
-      <w:proofErr w:type="spellEnd"/>
-      <w:r>
-        <w:rPr>
-          <w:lang w:val="es-419"/>
-        </w:rPr>
-        <w:t xml:space="preserve"> es código muerto hoy (H-05): conectarla ahora no resuelve ningún punto de dolor real y agrega acoplamiento a una clase que el negocio no usa. La corrección correcta de la creación de productos pertenece al TO-BE, no al AS-IS.</w:t>
-      </w:r>
-    </w:p>
-    <w:p>
-      <w:pPr>
-        <w:rPr>
-          <w:lang w:val="es-419"/>
-        </w:rPr>
-      </w:pPr>
-    </w:p>
-    <w:p>
-      <w:pPr>
-        <w:jc w:val="center"/>
+      </w:pPr>
+      <w:r>
         <w:rPr>
           <w:b/>
           <w:bCs/>
         </w:rPr>
-      </w:pPr>
-      <w:r>
+        <w:t>Veredicto: RECHAZADA en el AS-IS.</w:t>
+      </w:r>
+    </w:p>
+    <w:p>
+      <w:pPr>
+        <w:ind w:firstLine="720"/>
+      </w:pPr>
+      <w:r>
+        <w:t xml:space="preserve">La propuesta se rechaza tal como fue planteada porque sustituir la construcción actual por </w:t>
+      </w:r>
+      <w:proofErr w:type="spellStart"/>
+      <w:r>
+        <w:t>ProductoFactory.CrearCapsula</w:t>
+      </w:r>
+      <w:proofErr w:type="spellEnd"/>
+      <w:r>
+        <w:t xml:space="preserve">() modificaría valores utilizados por el comportamiento existente. Actualmente, </w:t>
+      </w:r>
+      <w:proofErr w:type="spellStart"/>
+      <w:r>
+        <w:t>CargarDesdeArchivo</w:t>
+      </w:r>
+      <w:proofErr w:type="spellEnd"/>
+      <w:r>
+        <w:t xml:space="preserve"> obtiene el stock mínimo y la fecha de vencimiento directamente del archivo, mientras que la </w:t>
+      </w:r>
+      <w:proofErr w:type="spellStart"/>
+      <w:r>
+        <w:t>factory</w:t>
+      </w:r>
+      <w:proofErr w:type="spellEnd"/>
+      <w:r>
+        <w:t xml:space="preserve"> asigna valores predeterminados.</w:t>
+      </w:r>
+    </w:p>
+    <w:p>
+      <w:pPr>
+        <w:ind w:firstLine="720"/>
+        <w:rPr>
+          <w:lang w:val="es-419"/>
+        </w:rPr>
+      </w:pPr>
+      <w:r>
+        <w:rPr>
+          <w:lang w:val="es-419"/>
+        </w:rPr>
+        <w:lastRenderedPageBreak/>
+        <w:t xml:space="preserve">Si se reemplazara la creación directa por la </w:t>
+      </w:r>
+      <w:proofErr w:type="spellStart"/>
+      <w:r>
+        <w:rPr>
+          <w:lang w:val="es-419"/>
+        </w:rPr>
+        <w:t>factory</w:t>
+      </w:r>
+      <w:proofErr w:type="spellEnd"/>
+      <w:r>
+        <w:rPr>
+          <w:lang w:val="es-419"/>
+        </w:rPr>
+        <w:t>, los productos cargados tendrían stock mínimo y fecha de vencimiento distintos a los del archivo → las alertas de stock y vencimiento cambiarían de comportamiento → se viola la restricción dura (sección 1 del enunciado).</w:t>
+      </w:r>
+    </w:p>
+    <w:p>
+      <w:pPr>
+        <w:ind w:firstLine="720"/>
+        <w:rPr>
+          <w:lang w:val="es-419"/>
+        </w:rPr>
+      </w:pPr>
+      <w:r>
+        <w:rPr>
+          <w:lang w:val="es-419"/>
+        </w:rPr>
+        <w:t xml:space="preserve">Además, la </w:t>
+      </w:r>
+      <w:proofErr w:type="spellStart"/>
+      <w:r>
+        <w:rPr>
+          <w:lang w:val="es-419"/>
+        </w:rPr>
+        <w:t>factory</w:t>
+      </w:r>
+      <w:proofErr w:type="spellEnd"/>
+      <w:r>
+        <w:rPr>
+          <w:lang w:val="es-419"/>
+        </w:rPr>
+        <w:t xml:space="preserve"> es código muerto hoy (sin hallazgo propio en la tabla; ver mapa de dependencias: ServicioDescuento, ServicioNotificacion y ProductoFactory sin consumidores): conectarla ahora no resuelve ningún punto de dolor real y agrega acoplamiento a una clase que el negocio no usa. La corrección correcta de la creación de productos pertenece al TO-BE, no al AS-IS.</w:t>
+      </w:r>
+    </w:p>
+    <w:p>
+      <w:pPr>
+        <w:rPr>
+          <w:lang w:val="es-419"/>
+        </w:rPr>
+      </w:pPr>
+    </w:p>
+    <w:p>
+      <w:pPr>
         <w:rPr>
           <w:b/>
           <w:bCs/>
         </w:rPr>
-        <w:t>Puntos de dolor Del proyecto</w:t>
-      </w:r>
-    </w:p>
-    <w:p>
-      <w:pPr>
+      </w:pPr>
+      <w:r>
         <w:rPr>
           <w:b/>
           <w:bCs/>
         </w:rPr>
-      </w:pPr>
-      <w:r>
+        <w:t>Puntos de dolor Del proyecto</w:t>
+      </w:r>
+    </w:p>
+    <w:p>
+      <w:pPr>
+        <w:ind w:firstLine="720"/>
+      </w:pPr>
+      <w:r>
+        <w:t>Criterio de priorizacion (explicito): (1) impacto financiero inmediato sobre la operacion critica de venta y la consistencia inventario-caja; (2) alcance del riesgo de persistencia; (3) costo de cambio futuro y capacidad de crecimiento. Bajo este criterio, el punto 1 supera al 2 porque afecta cada operacion de venta (dinero en tiempo real), mientras que el 2 solo se manifiesta durante la carga de datos; y el 2 supera al 3 porque cambiar la persistencia toca mas modulos (catalogo, clientes y autenticacion) que ampliar presentaciones de producto.</w:t>
+      </w:r>
+    </w:p>
+    <w:p>
+      <w:pPr>
         <w:rPr>
           <w:b/>
           <w:bCs/>
         </w:rPr>
-        <w:t xml:space="preserve">1. </w:t>
-      </w:r>
+      </w:pPr>
       <w:r>
         <w:rPr>
           <w:b/>
           <w:bCs/>
         </w:rPr>
+        <w:t xml:space="preserve">1. </w:t>
+      </w:r>
+      <w:r>
+        <w:rPr>
+          <w:b/>
+          <w:bCs/>
+        </w:rPr>
         <w:t>Reglas de negocio mezcladas con la interfaz de consola</w:t>
       </w:r>
     </w:p>
     <w:p>
+      <w:pPr>
+        <w:ind w:firstLine="720"/>
+      </w:pPr>
       <w:r>
         <w:t xml:space="preserve">En </w:t>
       </w:r>
@@ -1309,6 +1690,7 @@
           <w:ilvl w:val="0"/>
           <w:numId w:val="5"/>
         </w:numPr>
+        <w:ind w:firstLine="720"/>
       </w:pPr>
       <w:r>
         <w:t xml:space="preserve">Se busca el producto. </w:t>
@@ -1320,6 +1702,7 @@
           <w:ilvl w:val="0"/>
           <w:numId w:val="5"/>
         </w:numPr>
+        <w:ind w:firstLine="720"/>
       </w:pPr>
       <w:r>
         <w:t xml:space="preserve">Se descuenta el inventario. </w:t>
@@ -1331,6 +1714,7 @@
           <w:ilvl w:val="0"/>
           <w:numId w:val="5"/>
         </w:numPr>
+        <w:ind w:firstLine="720"/>
       </w:pPr>
       <w:r>
         <w:t xml:space="preserve">Se crea el movimiento. </w:t>
@@ -1342,6 +1726,7 @@
           <w:ilvl w:val="0"/>
           <w:numId w:val="5"/>
         </w:numPr>
+        <w:ind w:firstLine="720"/>
       </w:pPr>
       <w:r>
         <w:t xml:space="preserve">Se registra la venta. </w:t>
@@ -1353,17 +1738,25 @@
           <w:ilvl w:val="0"/>
           <w:numId w:val="5"/>
         </w:numPr>
+        <w:ind w:firstLine="720"/>
       </w:pPr>
       <w:r>
         <w:t xml:space="preserve">Se muestran mensajes. </w:t>
       </w:r>
     </w:p>
     <w:p>
-      <w:r>
+      <w:pPr>
+        <w:ind w:firstLine="720"/>
+      </w:pPr>
+      <w:r>
+        <w:lastRenderedPageBreak/>
         <w:t>El problema es que la regla de venta queda ligada al canal de consola. Si mañana aparece una página web o una API, ese canal tendría que volver a implementar todos los pasos y podría omitir alguno.</w:t>
       </w:r>
     </w:p>
     <w:p>
+      <w:pPr>
+        <w:ind w:firstLine="720"/>
+      </w:pPr>
       <w:r>
         <w:rPr>
           <w:b/>
@@ -1378,6 +1771,7 @@
           <w:ilvl w:val="0"/>
           <w:numId w:val="6"/>
         </w:numPr>
+        <w:ind w:firstLine="720"/>
       </w:pPr>
       <w:r>
         <w:t xml:space="preserve">Diferencias entre inventario y movimientos. </w:t>
@@ -1389,6 +1783,7 @@
           <w:ilvl w:val="0"/>
           <w:numId w:val="6"/>
         </w:numPr>
+        <w:ind w:firstLine="720"/>
       </w:pPr>
       <w:r>
         <w:t xml:space="preserve">Problemas en el cuadre de caja. </w:t>
@@ -1400,9 +1795,9 @@
           <w:ilvl w:val="0"/>
           <w:numId w:val="6"/>
         </w:numPr>
-      </w:pPr>
-      <w:r>
-        <w:lastRenderedPageBreak/>
+        <w:ind w:firstLine="720"/>
+      </w:pPr>
+      <w:r>
         <w:t xml:space="preserve">Duplicación de reglas entre canales. </w:t>
       </w:r>
     </w:p>
@@ -1412,6 +1807,7 @@
           <w:ilvl w:val="0"/>
           <w:numId w:val="6"/>
         </w:numPr>
+        <w:ind w:firstLine="720"/>
       </w:pPr>
       <w:r>
         <w:t>Mayor riesgo de errores al agregar nuevas formas de venta.</w:t>
@@ -1433,14 +1829,13 @@
       </w:r>
     </w:p>
     <w:p>
+      <w:pPr>
+        <w:ind w:firstLine="720"/>
+      </w:pPr>
       <w:r>
         <w:t>Este punto ocupa el primer lugar porque afecta directamente una operación crítica del negocio: la venta. Al estar la actualización del inventario y el registro del movimiento ligados al canal de consola, cualquier nuevo canal podría implementar el proceso de forma incompleta y generar diferencias entre ventas, existencias, movimientos y cuadre de caja. Su impacto es inmediato y financiero, por eso se prioriza sobre los problemas de persistencia y mantenimiento.</w:t>
       </w:r>
     </w:p>
-    <w:p/>
-    <w:p/>
-    <w:p/>
-    <w:p/>
     <w:p>
       <w:pPr>
         <w:rPr>
@@ -1477,6 +1872,7 @@
           <w:ilvl w:val="0"/>
           <w:numId w:val="7"/>
         </w:numPr>
+        <w:ind w:firstLine="720"/>
       </w:pPr>
       <w:proofErr w:type="spellStart"/>
       <w:r>
@@ -1493,6 +1889,7 @@
           <w:ilvl w:val="0"/>
           <w:numId w:val="7"/>
         </w:numPr>
+        <w:ind w:firstLine="720"/>
       </w:pPr>
       <w:proofErr w:type="spellStart"/>
       <w:r>
@@ -1509,6 +1906,7 @@
           <w:ilvl w:val="0"/>
           <w:numId w:val="7"/>
         </w:numPr>
+        <w:ind w:firstLine="720"/>
       </w:pPr>
       <w:proofErr w:type="spellStart"/>
       <w:r>
@@ -1535,6 +1933,9 @@
       </w:r>
     </w:p>
     <w:p>
+      <w:pPr>
+        <w:ind w:firstLine="720"/>
+      </w:pPr>
       <w:r>
         <w:t>Los servicios dependen directamente de detalles técnicos de persistencia y formato, como:</w:t>
       </w:r>
@@ -1545,6 +1946,7 @@
           <w:ilvl w:val="0"/>
           <w:numId w:val="8"/>
         </w:numPr>
+        <w:ind w:firstLine="720"/>
       </w:pPr>
       <w:proofErr w:type="spellStart"/>
       <w:r>
@@ -1561,8 +1963,10 @@
           <w:ilvl w:val="0"/>
           <w:numId w:val="8"/>
         </w:numPr>
-      </w:pPr>
-      <w:r>
+        <w:ind w:firstLine="720"/>
+      </w:pPr>
+      <w:r>
+        <w:lastRenderedPageBreak/>
         <w:t xml:space="preserve">Rutas físicas. </w:t>
       </w:r>
     </w:p>
@@ -1572,6 +1976,7 @@
           <w:ilvl w:val="0"/>
           <w:numId w:val="8"/>
         </w:numPr>
+        <w:ind w:firstLine="720"/>
       </w:pPr>
       <w:r>
         <w:t xml:space="preserve">Archivos TXT. </w:t>
@@ -1583,6 +1988,7 @@
           <w:ilvl w:val="0"/>
           <w:numId w:val="8"/>
         </w:numPr>
+        <w:ind w:firstLine="720"/>
       </w:pPr>
       <w:proofErr w:type="gramStart"/>
       <w:r>
@@ -1599,6 +2005,7 @@
           <w:ilvl w:val="0"/>
           <w:numId w:val="8"/>
         </w:numPr>
+        <w:ind w:firstLine="720"/>
       </w:pPr>
       <w:r>
         <w:t xml:space="preserve">Posiciones específicas como </w:t>
@@ -1618,6 +2025,7 @@
           <w:ilvl w:val="0"/>
           <w:numId w:val="8"/>
         </w:numPr>
+        <w:ind w:firstLine="720"/>
       </w:pPr>
       <w:r>
         <w:t xml:space="preserve">Conversiones concretas de fechas y números. </w:t>
@@ -1625,6 +2033,7 @@
     </w:p>
     <w:p>
       <w:pPr>
+        <w:ind w:firstLine="720"/>
         <w:rPr>
           <w:b/>
           <w:bCs/>
@@ -1646,11 +2055,13 @@
           <w:b/>
           <w:bCs/>
         </w:rPr>
-        <w:lastRenderedPageBreak/>
         <w:t>Razón de prioridad</w:t>
       </w:r>
     </w:p>
     <w:p>
+      <w:pPr>
+        <w:ind w:firstLine="720"/>
+      </w:pPr>
       <w:r>
         <w:t>Este punto ocupa el segundo lugar porque su riesgo aparece principalmente durante la carga de datos o al cambiar el mecanismo de persistencia. Aunque tiene un impacto amplio en varios módulos, no afecta directamente cada operación de venta ni la consistencia inmediata entre inventario, movimientos y caja, como ocurre con el punto de dolor número uno.</w:t>
       </w:r>
@@ -1677,6 +2088,7 @@
           <w:ilvl w:val="0"/>
           <w:numId w:val="4"/>
         </w:numPr>
+        <w:ind w:firstLine="720"/>
       </w:pPr>
       <w:r>
         <w:t xml:space="preserve">Ubicación: </w:t>
@@ -1706,6 +2118,9 @@
       </w:r>
     </w:p>
     <w:p>
+      <w:pPr>
+        <w:ind w:firstLine="720"/>
+      </w:pPr>
       <w:r>
         <w:t xml:space="preserve">El método de carga construye siempre una instancia concreta de </w:t>
       </w:r>
@@ -1714,6 +2129,7 @@
         <w:rPr>
           <w:rStyle w:val="CdigoHTML"/>
           <w:rFonts w:asciiTheme="majorHAnsi" w:eastAsiaTheme="minorHAnsi" w:hAnsiTheme="majorHAnsi" w:cstheme="majorHAnsi"/>
+          <w:sz w:val="24"/>
         </w:rPr>
         <w:t>MedicamentoCapsula</w:t>
       </w:r>
@@ -1725,7 +2141,8 @@
       <w:r>
         <w:rPr>
           <w:rStyle w:val="CdigoHTML"/>
-          <w:rFonts w:eastAsiaTheme="minorHAnsi"/>
+          <w:rFonts w:ascii="Times New Roman" w:eastAsiaTheme="minorHAnsi" w:hAnsi="Times New Roman" w:cs="Times New Roman"/>
+          <w:sz w:val="24"/>
         </w:rPr>
         <w:t>TipoRelleno.Gel</w:t>
       </w:r>
@@ -1735,6 +2152,9 @@
       </w:r>
     </w:p>
     <w:p>
+      <w:pPr>
+        <w:ind w:firstLine="720"/>
+      </w:pPr>
       <w:r>
         <w:t xml:space="preserve">Aunque </w:t>
       </w:r>
@@ -1748,6 +2168,9 @@
       </w:r>
     </w:p>
     <w:p>
+      <w:pPr>
+        <w:ind w:firstLine="720"/>
+      </w:pPr>
       <w:r>
         <w:t>La farmacia no puede cargar correctamente medicamentos líquidos ni nuevas presentaciones desde el archivo. Incorporar otro tipo de producto obliga a modificar el método existente, aumentando el costo del cambio y el riesgo de afectar la carga actual.</w:t>
       </w:r>
@@ -1768,26 +2191,16 @@
       </w:r>
     </w:p>
     <w:p>
-      <w:r>
+      <w:pPr>
+        <w:ind w:firstLine="720"/>
+      </w:pPr>
+      <w:r>
+        <w:lastRenderedPageBreak/>
         <w:t>Este punto ocupa el tercer lugar porque no altera directamente las ventas ni la consistencia inmediata del inventario existente. Sin embargo, limita la capacidad de crecimiento del sistema, incluso frente a tipos de medicamentos que el propio dominio ya contempla, y su impacto aumentará cuando la farmacia necesite manejar nuevas presentaciones.</w:t>
       </w:r>
     </w:p>
-    <w:p/>
-    <w:p/>
-    <w:p/>
-    <w:p/>
-    <w:p/>
-    <w:p/>
-    <w:p/>
-    <w:p/>
-    <w:p/>
-    <w:p/>
-    <w:p/>
-    <w:p/>
-    <w:p/>
-    <w:p>
-      <w:pPr>
-        <w:jc w:val="center"/>
+    <w:p>
+      <w:pPr>
         <w:rPr>
           <w:b/>
           <w:bCs/>
@@ -1823,10 +2236,10 @@
         <w:tblLook w:val="04A0" w:firstRow="1" w:lastRow="0" w:firstColumn="1" w:lastColumn="0" w:noHBand="0" w:noVBand="1"/>
       </w:tblPr>
       <w:tblGrid>
-        <w:gridCol w:w="2356"/>
-        <w:gridCol w:w="6364"/>
-        <w:gridCol w:w="2332"/>
-        <w:gridCol w:w="3078"/>
+        <w:gridCol w:w="2349"/>
+        <w:gridCol w:w="3032"/>
+        <w:gridCol w:w="1738"/>
+        <w:gridCol w:w="2231"/>
       </w:tblGrid>
       <w:tr>
         <w:tc>
@@ -1836,17 +2249,13 @@
           <w:p>
             <w:pPr>
               <w:rPr>
-                <w:rFonts w:asciiTheme="minorHAnsi" w:hAnsiTheme="minorHAnsi" w:cstheme="minorHAnsi"/>
                 <w:b/>
-                <w:sz w:val="24"/>
-                <w:szCs w:val="24"/>
-              </w:rPr>
-            </w:pPr>
-            <w:r>
-              <w:rPr>
-                <w:rFonts w:asciiTheme="minorHAnsi" w:hAnsiTheme="minorHAnsi" w:cstheme="minorHAnsi"/>
+                <w:szCs w:val="24"/>
+              </w:rPr>
+            </w:pPr>
+            <w:r>
+              <w:rPr>
                 <w:b/>
-                <w:sz w:val="24"/>
                 <w:szCs w:val="24"/>
               </w:rPr>
               <w:t>Clase</w:t>
@@ -1860,17 +2269,13 @@
           <w:p>
             <w:pPr>
               <w:rPr>
-                <w:rFonts w:asciiTheme="minorHAnsi" w:hAnsiTheme="minorHAnsi" w:cstheme="minorHAnsi"/>
                 <w:b/>
-                <w:sz w:val="24"/>
-                <w:szCs w:val="24"/>
-              </w:rPr>
-            </w:pPr>
-            <w:r>
-              <w:rPr>
-                <w:rFonts w:asciiTheme="minorHAnsi" w:hAnsiTheme="minorHAnsi" w:cstheme="minorHAnsi"/>
+                <w:szCs w:val="24"/>
+              </w:rPr>
+            </w:pPr>
+            <w:r>
+              <w:rPr>
                 <w:b/>
-                <w:sz w:val="24"/>
                 <w:szCs w:val="24"/>
               </w:rPr>
               <w:t>Depende de</w:t>
@@ -1884,17 +2289,13 @@
           <w:p>
             <w:pPr>
               <w:rPr>
-                <w:rFonts w:asciiTheme="minorHAnsi" w:hAnsiTheme="minorHAnsi" w:cstheme="minorHAnsi"/>
                 <w:b/>
-                <w:sz w:val="24"/>
-                <w:szCs w:val="24"/>
-              </w:rPr>
-            </w:pPr>
-            <w:r>
-              <w:rPr>
-                <w:rFonts w:asciiTheme="minorHAnsi" w:hAnsiTheme="minorHAnsi" w:cstheme="minorHAnsi"/>
+                <w:szCs w:val="24"/>
+              </w:rPr>
+            </w:pPr>
+            <w:r>
+              <w:rPr>
                 <w:b/>
-                <w:sz w:val="24"/>
                 <w:szCs w:val="24"/>
               </w:rPr>
               <w:t>Nivel</w:t>
@@ -1908,17 +2309,13 @@
           <w:p>
             <w:pPr>
               <w:rPr>
-                <w:rFonts w:asciiTheme="minorHAnsi" w:hAnsiTheme="minorHAnsi" w:cstheme="minorHAnsi"/>
                 <w:b/>
-                <w:sz w:val="24"/>
-                <w:szCs w:val="24"/>
-              </w:rPr>
-            </w:pPr>
-            <w:r>
-              <w:rPr>
-                <w:rFonts w:asciiTheme="minorHAnsi" w:hAnsiTheme="minorHAnsi" w:cstheme="minorHAnsi"/>
+                <w:szCs w:val="24"/>
+              </w:rPr>
+            </w:pPr>
+            <w:r>
+              <w:rPr>
                 <w:b/>
-                <w:sz w:val="24"/>
                 <w:szCs w:val="24"/>
               </w:rPr>
               <w:t>Naturaleza</w:t>
@@ -1934,16 +2331,12 @@
           <w:p>
             <w:pPr>
               <w:rPr>
-                <w:rFonts w:asciiTheme="minorHAnsi" w:hAnsiTheme="minorHAnsi" w:cstheme="minorHAnsi"/>
-                <w:sz w:val="24"/>
                 <w:szCs w:val="24"/>
               </w:rPr>
             </w:pPr>
             <w:proofErr w:type="spellStart"/>
             <w:r>
               <w:rPr>
-                <w:rFonts w:asciiTheme="minorHAnsi" w:hAnsiTheme="minorHAnsi" w:cstheme="minorHAnsi"/>
-                <w:sz w:val="24"/>
                 <w:szCs w:val="24"/>
               </w:rPr>
               <w:t>ServicioProducto</w:t>
@@ -1958,15 +2351,11 @@
           <w:p>
             <w:pPr>
               <w:rPr>
-                <w:rFonts w:asciiTheme="minorHAnsi" w:hAnsiTheme="minorHAnsi" w:cstheme="minorHAnsi"/>
-                <w:sz w:val="24"/>
-                <w:szCs w:val="24"/>
-              </w:rPr>
-            </w:pPr>
-            <w:r>
-              <w:rPr>
-                <w:rFonts w:asciiTheme="minorHAnsi" w:hAnsiTheme="minorHAnsi" w:cstheme="minorHAnsi"/>
-                <w:sz w:val="24"/>
+                <w:szCs w:val="24"/>
+              </w:rPr>
+            </w:pPr>
+            <w:r>
+              <w:rPr>
                 <w:szCs w:val="24"/>
               </w:rPr>
               <w:t xml:space="preserve">Producto (lista), </w:t>
@@ -1974,8 +2363,6 @@
             <w:proofErr w:type="spellStart"/>
             <w:r>
               <w:rPr>
-                <w:rFonts w:asciiTheme="minorHAnsi" w:hAnsiTheme="minorHAnsi" w:cstheme="minorHAnsi"/>
-                <w:sz w:val="24"/>
                 <w:szCs w:val="24"/>
               </w:rPr>
               <w:t>EventoStockMinimo</w:t>
@@ -1983,8 +2370,6 @@
             <w:proofErr w:type="spellEnd"/>
             <w:r>
               <w:rPr>
-                <w:rFonts w:asciiTheme="minorHAnsi" w:hAnsiTheme="minorHAnsi" w:cstheme="minorHAnsi"/>
-                <w:sz w:val="24"/>
                 <w:szCs w:val="24"/>
               </w:rPr>
               <w:t xml:space="preserve">, </w:t>
@@ -1992,8 +2377,6 @@
             <w:proofErr w:type="spellStart"/>
             <w:r>
               <w:rPr>
-                <w:rFonts w:asciiTheme="minorHAnsi" w:hAnsiTheme="minorHAnsi" w:cstheme="minorHAnsi"/>
-                <w:sz w:val="24"/>
                 <w:szCs w:val="24"/>
               </w:rPr>
               <w:t>EventoVencimiento</w:t>
@@ -2001,8 +2384,6 @@
             <w:proofErr w:type="spellEnd"/>
             <w:r>
               <w:rPr>
-                <w:rFonts w:asciiTheme="minorHAnsi" w:hAnsiTheme="minorHAnsi" w:cstheme="minorHAnsi"/>
-                <w:sz w:val="24"/>
                 <w:szCs w:val="24"/>
               </w:rPr>
               <w:t xml:space="preserve">, </w:t>
@@ -2010,8 +2391,6 @@
             <w:proofErr w:type="spellStart"/>
             <w:r>
               <w:rPr>
-                <w:rFonts w:asciiTheme="minorHAnsi" w:hAnsiTheme="minorHAnsi" w:cstheme="minorHAnsi"/>
-                <w:sz w:val="24"/>
                 <w:szCs w:val="24"/>
               </w:rPr>
               <w:t>MedicamentoCapsula</w:t>
@@ -2019,8 +2398,6 @@
             <w:proofErr w:type="spellEnd"/>
             <w:r>
               <w:rPr>
-                <w:rFonts w:asciiTheme="minorHAnsi" w:hAnsiTheme="minorHAnsi" w:cstheme="minorHAnsi"/>
-                <w:sz w:val="24"/>
                 <w:szCs w:val="24"/>
               </w:rPr>
               <w:t xml:space="preserve">, Laboratorio, </w:t>
@@ -2028,8 +2405,6 @@
             <w:proofErr w:type="spellStart"/>
             <w:r>
               <w:rPr>
-                <w:rFonts w:asciiTheme="minorHAnsi" w:hAnsiTheme="minorHAnsi" w:cstheme="minorHAnsi"/>
-                <w:sz w:val="24"/>
                 <w:szCs w:val="24"/>
               </w:rPr>
               <w:t>TipoRelleno</w:t>
@@ -2037,8 +2412,6 @@
             <w:proofErr w:type="spellEnd"/>
             <w:r>
               <w:rPr>
-                <w:rFonts w:asciiTheme="minorHAnsi" w:hAnsiTheme="minorHAnsi" w:cstheme="minorHAnsi"/>
-                <w:sz w:val="24"/>
                 <w:szCs w:val="24"/>
               </w:rPr>
               <w:t>, File (I/O)</w:t>
@@ -2052,15 +2425,11 @@
           <w:p>
             <w:pPr>
               <w:rPr>
-                <w:rFonts w:asciiTheme="minorHAnsi" w:hAnsiTheme="minorHAnsi" w:cstheme="minorHAnsi"/>
-                <w:sz w:val="24"/>
-                <w:szCs w:val="24"/>
-              </w:rPr>
-            </w:pPr>
-            <w:r>
-              <w:rPr>
-                <w:rFonts w:asciiTheme="minorHAnsi" w:hAnsiTheme="minorHAnsi" w:cstheme="minorHAnsi"/>
-                <w:sz w:val="24"/>
+                <w:szCs w:val="24"/>
+              </w:rPr>
+            </w:pPr>
+            <w:r>
+              <w:rPr>
                 <w:szCs w:val="24"/>
               </w:rPr>
               <w:t>Alto (reglas de negocio)</w:t>
@@ -2074,15 +2443,11 @@
           <w:p>
             <w:pPr>
               <w:rPr>
-                <w:rFonts w:asciiTheme="minorHAnsi" w:hAnsiTheme="minorHAnsi" w:cstheme="minorHAnsi"/>
-                <w:sz w:val="24"/>
-                <w:szCs w:val="24"/>
-              </w:rPr>
-            </w:pPr>
-            <w:r>
-              <w:rPr>
-                <w:rFonts w:asciiTheme="minorHAnsi" w:hAnsiTheme="minorHAnsi" w:cstheme="minorHAnsi"/>
-                <w:sz w:val="24"/>
+                <w:szCs w:val="24"/>
+              </w:rPr>
+            </w:pPr>
+            <w:r>
+              <w:rPr>
                 <w:szCs w:val="24"/>
               </w:rPr>
               <w:t xml:space="preserve">Concreta (new, </w:t>
@@ -2090,8 +2455,6 @@
             <w:proofErr w:type="spellStart"/>
             <w:r>
               <w:rPr>
-                <w:rFonts w:asciiTheme="minorHAnsi" w:hAnsiTheme="minorHAnsi" w:cstheme="minorHAnsi"/>
-                <w:sz w:val="24"/>
                 <w:szCs w:val="24"/>
               </w:rPr>
               <w:t>File.ReadAllLines</w:t>
@@ -2099,8 +2462,6 @@
             <w:proofErr w:type="spellEnd"/>
             <w:r>
               <w:rPr>
-                <w:rFonts w:asciiTheme="minorHAnsi" w:hAnsiTheme="minorHAnsi" w:cstheme="minorHAnsi"/>
-                <w:sz w:val="24"/>
                 <w:szCs w:val="24"/>
               </w:rPr>
               <w:t>)</w:t>
@@ -2116,16 +2477,12 @@
           <w:p>
             <w:pPr>
               <w:rPr>
-                <w:rFonts w:asciiTheme="minorHAnsi" w:hAnsiTheme="minorHAnsi" w:cstheme="minorHAnsi"/>
-                <w:sz w:val="24"/>
                 <w:szCs w:val="24"/>
               </w:rPr>
             </w:pPr>
             <w:proofErr w:type="spellStart"/>
             <w:r>
               <w:rPr>
-                <w:rFonts w:asciiTheme="minorHAnsi" w:hAnsiTheme="minorHAnsi" w:cstheme="minorHAnsi"/>
-                <w:sz w:val="24"/>
                 <w:szCs w:val="24"/>
               </w:rPr>
               <w:t>ServicioCliente</w:t>
@@ -2140,15 +2497,11 @@
           <w:p>
             <w:pPr>
               <w:rPr>
-                <w:rFonts w:asciiTheme="minorHAnsi" w:hAnsiTheme="minorHAnsi" w:cstheme="minorHAnsi"/>
-                <w:sz w:val="24"/>
-                <w:szCs w:val="24"/>
-              </w:rPr>
-            </w:pPr>
-            <w:r>
-              <w:rPr>
-                <w:rFonts w:asciiTheme="minorHAnsi" w:hAnsiTheme="minorHAnsi" w:cstheme="minorHAnsi"/>
-                <w:sz w:val="24"/>
+                <w:szCs w:val="24"/>
+              </w:rPr>
+            </w:pPr>
+            <w:r>
+              <w:rPr>
                 <w:szCs w:val="24"/>
               </w:rPr>
               <w:t xml:space="preserve">Cliente (lista), </w:t>
@@ -2156,8 +2509,6 @@
             <w:proofErr w:type="spellStart"/>
             <w:r>
               <w:rPr>
-                <w:rFonts w:asciiTheme="minorHAnsi" w:hAnsiTheme="minorHAnsi" w:cstheme="minorHAnsi"/>
-                <w:sz w:val="24"/>
                 <w:szCs w:val="24"/>
               </w:rPr>
               <w:t>EventoPuntos</w:t>
@@ -2165,8 +2516,6 @@
             <w:proofErr w:type="spellEnd"/>
             <w:r>
               <w:rPr>
-                <w:rFonts w:asciiTheme="minorHAnsi" w:hAnsiTheme="minorHAnsi" w:cstheme="minorHAnsi"/>
-                <w:sz w:val="24"/>
                 <w:szCs w:val="24"/>
               </w:rPr>
               <w:t>, File (I/O)</w:t>
@@ -2180,15 +2529,11 @@
           <w:p>
             <w:pPr>
               <w:rPr>
-                <w:rFonts w:asciiTheme="minorHAnsi" w:hAnsiTheme="minorHAnsi" w:cstheme="minorHAnsi"/>
-                <w:sz w:val="24"/>
-                <w:szCs w:val="24"/>
-              </w:rPr>
-            </w:pPr>
-            <w:r>
-              <w:rPr>
-                <w:rFonts w:asciiTheme="minorHAnsi" w:hAnsiTheme="minorHAnsi" w:cstheme="minorHAnsi"/>
-                <w:sz w:val="24"/>
+                <w:szCs w:val="24"/>
+              </w:rPr>
+            </w:pPr>
+            <w:r>
+              <w:rPr>
                 <w:szCs w:val="24"/>
               </w:rPr>
               <w:t>Alto</w:t>
@@ -2202,15 +2547,11 @@
           <w:p>
             <w:pPr>
               <w:rPr>
-                <w:rFonts w:asciiTheme="minorHAnsi" w:hAnsiTheme="minorHAnsi" w:cstheme="minorHAnsi"/>
-                <w:sz w:val="24"/>
-                <w:szCs w:val="24"/>
-              </w:rPr>
-            </w:pPr>
-            <w:r>
-              <w:rPr>
-                <w:rFonts w:asciiTheme="minorHAnsi" w:hAnsiTheme="minorHAnsi" w:cstheme="minorHAnsi"/>
-                <w:sz w:val="24"/>
+                <w:szCs w:val="24"/>
+              </w:rPr>
+            </w:pPr>
+            <w:r>
+              <w:rPr>
                 <w:szCs w:val="24"/>
               </w:rPr>
               <w:t>Concreta</w:t>
@@ -2226,16 +2567,12 @@
           <w:p>
             <w:pPr>
               <w:rPr>
-                <w:rFonts w:asciiTheme="minorHAnsi" w:hAnsiTheme="minorHAnsi" w:cstheme="minorHAnsi"/>
-                <w:sz w:val="24"/>
                 <w:szCs w:val="24"/>
               </w:rPr>
             </w:pPr>
             <w:proofErr w:type="spellStart"/>
             <w:r>
               <w:rPr>
-                <w:rFonts w:asciiTheme="minorHAnsi" w:hAnsiTheme="minorHAnsi" w:cstheme="minorHAnsi"/>
-                <w:sz w:val="24"/>
                 <w:szCs w:val="24"/>
               </w:rPr>
               <w:t>ServicioUsuario</w:t>
@@ -2250,15 +2587,11 @@
           <w:p>
             <w:pPr>
               <w:rPr>
-                <w:rFonts w:asciiTheme="minorHAnsi" w:hAnsiTheme="minorHAnsi" w:cstheme="minorHAnsi"/>
-                <w:sz w:val="24"/>
-                <w:szCs w:val="24"/>
-              </w:rPr>
-            </w:pPr>
-            <w:r>
-              <w:rPr>
-                <w:rFonts w:asciiTheme="minorHAnsi" w:hAnsiTheme="minorHAnsi" w:cstheme="minorHAnsi"/>
-                <w:sz w:val="24"/>
+                <w:szCs w:val="24"/>
+              </w:rPr>
+            </w:pPr>
+            <w:r>
+              <w:rPr>
                 <w:szCs w:val="24"/>
               </w:rPr>
               <w:t xml:space="preserve">Usuario (lista), </w:t>
@@ -2266,8 +2599,6 @@
             <w:proofErr w:type="spellStart"/>
             <w:r>
               <w:rPr>
-                <w:rFonts w:asciiTheme="minorHAnsi" w:hAnsiTheme="minorHAnsi" w:cstheme="minorHAnsi"/>
-                <w:sz w:val="24"/>
                 <w:szCs w:val="24"/>
               </w:rPr>
               <w:t>AspectoAutenticacion</w:t>
@@ -2275,8 +2606,6 @@
             <w:proofErr w:type="spellEnd"/>
             <w:r>
               <w:rPr>
-                <w:rFonts w:asciiTheme="minorHAnsi" w:hAnsiTheme="minorHAnsi" w:cstheme="minorHAnsi"/>
-                <w:sz w:val="24"/>
                 <w:szCs w:val="24"/>
               </w:rPr>
               <w:t>, File (I/O)</w:t>
@@ -2290,15 +2619,11 @@
           <w:p>
             <w:pPr>
               <w:rPr>
-                <w:rFonts w:asciiTheme="minorHAnsi" w:hAnsiTheme="minorHAnsi" w:cstheme="minorHAnsi"/>
-                <w:sz w:val="24"/>
-                <w:szCs w:val="24"/>
-              </w:rPr>
-            </w:pPr>
-            <w:r>
-              <w:rPr>
-                <w:rFonts w:asciiTheme="minorHAnsi" w:hAnsiTheme="minorHAnsi" w:cstheme="minorHAnsi"/>
-                <w:sz w:val="24"/>
+                <w:szCs w:val="24"/>
+              </w:rPr>
+            </w:pPr>
+            <w:r>
+              <w:rPr>
                 <w:szCs w:val="24"/>
               </w:rPr>
               <w:t>Alto</w:t>
@@ -2312,15 +2637,11 @@
           <w:p>
             <w:pPr>
               <w:rPr>
-                <w:rFonts w:asciiTheme="minorHAnsi" w:hAnsiTheme="minorHAnsi" w:cstheme="minorHAnsi"/>
-                <w:sz w:val="24"/>
-                <w:szCs w:val="24"/>
-              </w:rPr>
-            </w:pPr>
-            <w:r>
-              <w:rPr>
-                <w:rFonts w:asciiTheme="minorHAnsi" w:hAnsiTheme="minorHAnsi" w:cstheme="minorHAnsi"/>
-                <w:sz w:val="24"/>
+                <w:szCs w:val="24"/>
+              </w:rPr>
+            </w:pPr>
+            <w:r>
+              <w:rPr>
                 <w:szCs w:val="24"/>
               </w:rPr>
               <w:t>Concreta + clase estática</w:t>
@@ -2336,16 +2657,12 @@
           <w:p>
             <w:pPr>
               <w:rPr>
-                <w:rFonts w:asciiTheme="minorHAnsi" w:hAnsiTheme="minorHAnsi" w:cstheme="minorHAnsi"/>
-                <w:sz w:val="24"/>
                 <w:szCs w:val="24"/>
               </w:rPr>
             </w:pPr>
             <w:proofErr w:type="spellStart"/>
             <w:r>
               <w:rPr>
-                <w:rFonts w:asciiTheme="minorHAnsi" w:hAnsiTheme="minorHAnsi" w:cstheme="minorHAnsi"/>
-                <w:sz w:val="24"/>
                 <w:szCs w:val="24"/>
               </w:rPr>
               <w:t>ServicioMovimiento</w:t>
@@ -2360,15 +2677,11 @@
           <w:p>
             <w:pPr>
               <w:rPr>
-                <w:rFonts w:asciiTheme="minorHAnsi" w:hAnsiTheme="minorHAnsi" w:cstheme="minorHAnsi"/>
-                <w:sz w:val="24"/>
-                <w:szCs w:val="24"/>
-              </w:rPr>
-            </w:pPr>
-            <w:r>
-              <w:rPr>
-                <w:rFonts w:asciiTheme="minorHAnsi" w:hAnsiTheme="minorHAnsi" w:cstheme="minorHAnsi"/>
-                <w:sz w:val="24"/>
+                <w:szCs w:val="24"/>
+              </w:rPr>
+            </w:pPr>
+            <w:r>
+              <w:rPr>
                 <w:szCs w:val="24"/>
               </w:rPr>
               <w:t xml:space="preserve">Movimiento (lista), </w:t>
@@ -2376,8 +2689,6 @@
             <w:proofErr w:type="spellStart"/>
             <w:r>
               <w:rPr>
-                <w:rFonts w:asciiTheme="minorHAnsi" w:hAnsiTheme="minorHAnsi" w:cstheme="minorHAnsi"/>
-                <w:sz w:val="24"/>
                 <w:szCs w:val="24"/>
               </w:rPr>
               <w:t>EventoMovimiento</w:t>
@@ -2392,15 +2703,11 @@
           <w:p>
             <w:pPr>
               <w:rPr>
-                <w:rFonts w:asciiTheme="minorHAnsi" w:hAnsiTheme="minorHAnsi" w:cstheme="minorHAnsi"/>
-                <w:sz w:val="24"/>
-                <w:szCs w:val="24"/>
-              </w:rPr>
-            </w:pPr>
-            <w:r>
-              <w:rPr>
-                <w:rFonts w:asciiTheme="minorHAnsi" w:hAnsiTheme="minorHAnsi" w:cstheme="minorHAnsi"/>
-                <w:sz w:val="24"/>
+                <w:szCs w:val="24"/>
+              </w:rPr>
+            </w:pPr>
+            <w:r>
+              <w:rPr>
                 <w:szCs w:val="24"/>
               </w:rPr>
               <w:t>Alto</w:t>
@@ -2414,15 +2721,11 @@
           <w:p>
             <w:pPr>
               <w:rPr>
-                <w:rFonts w:asciiTheme="minorHAnsi" w:hAnsiTheme="minorHAnsi" w:cstheme="minorHAnsi"/>
-                <w:sz w:val="24"/>
-                <w:szCs w:val="24"/>
-              </w:rPr>
-            </w:pPr>
-            <w:r>
-              <w:rPr>
-                <w:rFonts w:asciiTheme="minorHAnsi" w:hAnsiTheme="minorHAnsi" w:cstheme="minorHAnsi"/>
-                <w:sz w:val="24"/>
+                <w:szCs w:val="24"/>
+              </w:rPr>
+            </w:pPr>
+            <w:r>
+              <w:rPr>
                 <w:szCs w:val="24"/>
               </w:rPr>
               <w:t>Concreta</w:t>
@@ -2438,16 +2741,12 @@
           <w:p>
             <w:pPr>
               <w:rPr>
-                <w:rFonts w:asciiTheme="minorHAnsi" w:hAnsiTheme="minorHAnsi" w:cstheme="minorHAnsi"/>
-                <w:sz w:val="24"/>
                 <w:szCs w:val="24"/>
               </w:rPr>
             </w:pPr>
             <w:proofErr w:type="spellStart"/>
             <w:r>
               <w:rPr>
-                <w:rFonts w:asciiTheme="minorHAnsi" w:hAnsiTheme="minorHAnsi" w:cstheme="minorHAnsi"/>
-                <w:sz w:val="24"/>
                 <w:szCs w:val="24"/>
               </w:rPr>
               <w:t>ServicioDescuento</w:t>
@@ -2462,16 +2761,12 @@
           <w:p>
             <w:pPr>
               <w:rPr>
-                <w:rFonts w:asciiTheme="minorHAnsi" w:hAnsiTheme="minorHAnsi" w:cstheme="minorHAnsi"/>
-                <w:sz w:val="24"/>
                 <w:szCs w:val="24"/>
               </w:rPr>
             </w:pPr>
             <w:proofErr w:type="spellStart"/>
             <w:r>
               <w:rPr>
-                <w:rFonts w:asciiTheme="minorHAnsi" w:hAnsiTheme="minorHAnsi" w:cstheme="minorHAnsi"/>
-                <w:sz w:val="24"/>
                 <w:szCs w:val="24"/>
               </w:rPr>
               <w:t>IDescuento</w:t>
@@ -2486,15 +2781,11 @@
           <w:p>
             <w:pPr>
               <w:rPr>
-                <w:rFonts w:asciiTheme="minorHAnsi" w:hAnsiTheme="minorHAnsi" w:cstheme="minorHAnsi"/>
-                <w:sz w:val="24"/>
-                <w:szCs w:val="24"/>
-              </w:rPr>
-            </w:pPr>
-            <w:r>
-              <w:rPr>
-                <w:rFonts w:asciiTheme="minorHAnsi" w:hAnsiTheme="minorHAnsi" w:cstheme="minorHAnsi"/>
-                <w:sz w:val="24"/>
+                <w:szCs w:val="24"/>
+              </w:rPr>
+            </w:pPr>
+            <w:r>
+              <w:rPr>
                 <w:szCs w:val="24"/>
               </w:rPr>
               <w:t>Alto (sin consumidores)</w:t>
@@ -2508,15 +2799,11 @@
           <w:p>
             <w:pPr>
               <w:rPr>
-                <w:rFonts w:asciiTheme="minorHAnsi" w:hAnsiTheme="minorHAnsi" w:cstheme="minorHAnsi"/>
-                <w:sz w:val="24"/>
-                <w:szCs w:val="24"/>
-              </w:rPr>
-            </w:pPr>
-            <w:r>
-              <w:rPr>
-                <w:rFonts w:asciiTheme="minorHAnsi" w:hAnsiTheme="minorHAnsi" w:cstheme="minorHAnsi"/>
-                <w:sz w:val="24"/>
+                <w:szCs w:val="24"/>
+              </w:rPr>
+            </w:pPr>
+            <w:r>
+              <w:rPr>
                 <w:szCs w:val="24"/>
               </w:rPr>
               <w:t>Abstracta (única realización usada por nadie)</w:t>
@@ -2532,18 +2819,15 @@
           <w:p>
             <w:pPr>
               <w:rPr>
-                <w:rFonts w:asciiTheme="minorHAnsi" w:hAnsiTheme="minorHAnsi" w:cstheme="minorHAnsi"/>
-                <w:sz w:val="24"/>
                 <w:szCs w:val="24"/>
               </w:rPr>
             </w:pPr>
             <w:proofErr w:type="spellStart"/>
             <w:r>
               <w:rPr>
-                <w:rFonts w:asciiTheme="minorHAnsi" w:hAnsiTheme="minorHAnsi" w:cstheme="minorHAnsi"/>
-                <w:sz w:val="24"/>
-                <w:szCs w:val="24"/>
-              </w:rPr>
+                <w:szCs w:val="24"/>
+              </w:rPr>
+              <w:lastRenderedPageBreak/>
               <w:t>ServicioNotificacion</w:t>
             </w:r>
             <w:proofErr w:type="spellEnd"/>
@@ -2556,16 +2840,12 @@
           <w:p>
             <w:pPr>
               <w:rPr>
-                <w:rFonts w:asciiTheme="minorHAnsi" w:hAnsiTheme="minorHAnsi" w:cstheme="minorHAnsi"/>
-                <w:sz w:val="24"/>
                 <w:szCs w:val="24"/>
               </w:rPr>
             </w:pPr>
             <w:proofErr w:type="spellStart"/>
             <w:r>
               <w:rPr>
-                <w:rFonts w:asciiTheme="minorHAnsi" w:hAnsiTheme="minorHAnsi" w:cstheme="minorHAnsi"/>
-                <w:sz w:val="24"/>
                 <w:szCs w:val="24"/>
               </w:rPr>
               <w:t>IServicioNotificacion</w:t>
@@ -2580,15 +2860,11 @@
           <w:p>
             <w:pPr>
               <w:rPr>
-                <w:rFonts w:asciiTheme="minorHAnsi" w:hAnsiTheme="minorHAnsi" w:cstheme="minorHAnsi"/>
-                <w:sz w:val="24"/>
-                <w:szCs w:val="24"/>
-              </w:rPr>
-            </w:pPr>
-            <w:r>
-              <w:rPr>
-                <w:rFonts w:asciiTheme="minorHAnsi" w:hAnsiTheme="minorHAnsi" w:cstheme="minorHAnsi"/>
-                <w:sz w:val="24"/>
+                <w:szCs w:val="24"/>
+              </w:rPr>
+            </w:pPr>
+            <w:r>
+              <w:rPr>
                 <w:szCs w:val="24"/>
               </w:rPr>
               <w:t>Alto (sin consumidores)</w:t>
@@ -2602,15 +2878,11 @@
           <w:p>
             <w:pPr>
               <w:rPr>
-                <w:rFonts w:asciiTheme="minorHAnsi" w:hAnsiTheme="minorHAnsi" w:cstheme="minorHAnsi"/>
-                <w:sz w:val="24"/>
-                <w:szCs w:val="24"/>
-              </w:rPr>
-            </w:pPr>
-            <w:r>
-              <w:rPr>
-                <w:rFonts w:asciiTheme="minorHAnsi" w:hAnsiTheme="minorHAnsi" w:cstheme="minorHAnsi"/>
-                <w:sz w:val="24"/>
+                <w:szCs w:val="24"/>
+              </w:rPr>
+            </w:pPr>
+            <w:r>
+              <w:rPr>
                 <w:szCs w:val="24"/>
               </w:rPr>
               <w:t>Abstracta (ídem)</w:t>
@@ -2626,16 +2898,12 @@
           <w:p>
             <w:pPr>
               <w:rPr>
-                <w:rFonts w:asciiTheme="minorHAnsi" w:hAnsiTheme="minorHAnsi" w:cstheme="minorHAnsi"/>
-                <w:sz w:val="24"/>
                 <w:szCs w:val="24"/>
               </w:rPr>
             </w:pPr>
             <w:proofErr w:type="spellStart"/>
             <w:r>
               <w:rPr>
-                <w:rFonts w:asciiTheme="minorHAnsi" w:hAnsiTheme="minorHAnsi" w:cstheme="minorHAnsi"/>
-                <w:sz w:val="24"/>
                 <w:szCs w:val="24"/>
               </w:rPr>
               <w:t>Program</w:t>
@@ -2650,15 +2918,11 @@
           <w:p>
             <w:pPr>
               <w:rPr>
-                <w:rFonts w:asciiTheme="minorHAnsi" w:hAnsiTheme="minorHAnsi" w:cstheme="minorHAnsi"/>
-                <w:sz w:val="24"/>
-                <w:szCs w:val="24"/>
-              </w:rPr>
-            </w:pPr>
-            <w:r>
-              <w:rPr>
-                <w:rFonts w:asciiTheme="minorHAnsi" w:hAnsiTheme="minorHAnsi" w:cstheme="minorHAnsi"/>
-                <w:sz w:val="24"/>
+                <w:szCs w:val="24"/>
+              </w:rPr>
+            </w:pPr>
+            <w:r>
+              <w:rPr>
                 <w:szCs w:val="24"/>
               </w:rPr>
               <w:t xml:space="preserve">los 4 servicios concretos, Movimiento, </w:t>
@@ -2666,8 +2930,6 @@
             <w:proofErr w:type="spellStart"/>
             <w:r>
               <w:rPr>
-                <w:rFonts w:asciiTheme="minorHAnsi" w:hAnsiTheme="minorHAnsi" w:cstheme="minorHAnsi"/>
-                <w:sz w:val="24"/>
                 <w:szCs w:val="24"/>
               </w:rPr>
               <w:t>Console</w:t>
@@ -2682,15 +2944,11 @@
           <w:p>
             <w:pPr>
               <w:rPr>
-                <w:rFonts w:asciiTheme="minorHAnsi" w:hAnsiTheme="minorHAnsi" w:cstheme="minorHAnsi"/>
-                <w:sz w:val="24"/>
-                <w:szCs w:val="24"/>
-              </w:rPr>
-            </w:pPr>
-            <w:r>
-              <w:rPr>
-                <w:rFonts w:asciiTheme="minorHAnsi" w:hAnsiTheme="minorHAnsi" w:cstheme="minorHAnsi"/>
-                <w:sz w:val="24"/>
+                <w:szCs w:val="24"/>
+              </w:rPr>
+            </w:pPr>
+            <w:r>
+              <w:rPr>
                 <w:szCs w:val="24"/>
               </w:rPr>
               <w:t>— (</w:t>
@@ -2698,8 +2956,6 @@
             <w:proofErr w:type="spellStart"/>
             <w:r>
               <w:rPr>
-                <w:rFonts w:asciiTheme="minorHAnsi" w:hAnsiTheme="minorHAnsi" w:cstheme="minorHAnsi"/>
-                <w:sz w:val="24"/>
                 <w:szCs w:val="24"/>
               </w:rPr>
               <w:t>composition</w:t>
@@ -2707,8 +2963,6 @@
             <w:proofErr w:type="spellEnd"/>
             <w:r>
               <w:rPr>
-                <w:rFonts w:asciiTheme="minorHAnsi" w:hAnsiTheme="minorHAnsi" w:cstheme="minorHAnsi"/>
-                <w:sz w:val="24"/>
                 <w:szCs w:val="24"/>
               </w:rPr>
               <w:t xml:space="preserve"> </w:t>
@@ -2716,8 +2970,6 @@
             <w:proofErr w:type="spellStart"/>
             <w:r>
               <w:rPr>
-                <w:rFonts w:asciiTheme="minorHAnsi" w:hAnsiTheme="minorHAnsi" w:cstheme="minorHAnsi"/>
-                <w:sz w:val="24"/>
                 <w:szCs w:val="24"/>
               </w:rPr>
               <w:t>root</w:t>
@@ -2725,8 +2977,6 @@
             <w:proofErr w:type="spellEnd"/>
             <w:r>
               <w:rPr>
-                <w:rFonts w:asciiTheme="minorHAnsi" w:hAnsiTheme="minorHAnsi" w:cstheme="minorHAnsi"/>
-                <w:sz w:val="24"/>
                 <w:szCs w:val="24"/>
               </w:rPr>
               <w:t xml:space="preserve"> implícito)</w:t>
@@ -2740,15 +2990,11 @@
           <w:p>
             <w:pPr>
               <w:rPr>
-                <w:rFonts w:asciiTheme="minorHAnsi" w:hAnsiTheme="minorHAnsi" w:cstheme="minorHAnsi"/>
-                <w:sz w:val="24"/>
-                <w:szCs w:val="24"/>
-              </w:rPr>
-            </w:pPr>
-            <w:r>
-              <w:rPr>
-                <w:rFonts w:asciiTheme="minorHAnsi" w:hAnsiTheme="minorHAnsi" w:cstheme="minorHAnsi"/>
-                <w:sz w:val="24"/>
+                <w:szCs w:val="24"/>
+              </w:rPr>
+            </w:pPr>
+            <w:r>
+              <w:rPr>
                 <w:szCs w:val="24"/>
               </w:rPr>
               <w:t>Concreta</w:t>
@@ -2764,16 +3010,12 @@
           <w:p>
             <w:pPr>
               <w:rPr>
-                <w:rFonts w:asciiTheme="minorHAnsi" w:hAnsiTheme="minorHAnsi" w:cstheme="minorHAnsi"/>
-                <w:sz w:val="24"/>
                 <w:szCs w:val="24"/>
               </w:rPr>
             </w:pPr>
             <w:proofErr w:type="spellStart"/>
             <w:r>
               <w:rPr>
-                <w:rFonts w:asciiTheme="minorHAnsi" w:hAnsiTheme="minorHAnsi" w:cstheme="minorHAnsi"/>
-                <w:sz w:val="24"/>
                 <w:szCs w:val="24"/>
               </w:rPr>
               <w:t>AspectoAutenticacion</w:t>
@@ -2788,15 +3030,11 @@
           <w:p>
             <w:pPr>
               <w:rPr>
-                <w:rFonts w:asciiTheme="minorHAnsi" w:hAnsiTheme="minorHAnsi" w:cstheme="minorHAnsi"/>
-                <w:sz w:val="24"/>
-                <w:szCs w:val="24"/>
-              </w:rPr>
-            </w:pPr>
-            <w:r>
-              <w:rPr>
-                <w:rFonts w:asciiTheme="minorHAnsi" w:hAnsiTheme="minorHAnsi" w:cstheme="minorHAnsi"/>
-                <w:sz w:val="24"/>
+                <w:szCs w:val="24"/>
+              </w:rPr>
+            </w:pPr>
+            <w:r>
+              <w:rPr>
                 <w:szCs w:val="24"/>
               </w:rPr>
               <w:t>Usuario</w:t>
@@ -2810,15 +3048,11 @@
           <w:p>
             <w:pPr>
               <w:rPr>
-                <w:rFonts w:asciiTheme="minorHAnsi" w:hAnsiTheme="minorHAnsi" w:cstheme="minorHAnsi"/>
-                <w:sz w:val="24"/>
-                <w:szCs w:val="24"/>
-              </w:rPr>
-            </w:pPr>
-            <w:r>
-              <w:rPr>
-                <w:rFonts w:asciiTheme="minorHAnsi" w:hAnsiTheme="minorHAnsi" w:cstheme="minorHAnsi"/>
-                <w:sz w:val="24"/>
+                <w:szCs w:val="24"/>
+              </w:rPr>
+            </w:pPr>
+            <w:r>
+              <w:rPr>
                 <w:szCs w:val="24"/>
               </w:rPr>
               <w:t>Bajo (detalle técnico)</w:t>
@@ -2832,15 +3066,11 @@
           <w:p>
             <w:pPr>
               <w:rPr>
-                <w:rFonts w:asciiTheme="minorHAnsi" w:hAnsiTheme="minorHAnsi" w:cstheme="minorHAnsi"/>
-                <w:sz w:val="24"/>
-                <w:szCs w:val="24"/>
-              </w:rPr>
-            </w:pPr>
-            <w:r>
-              <w:rPr>
-                <w:rFonts w:asciiTheme="minorHAnsi" w:hAnsiTheme="minorHAnsi" w:cstheme="minorHAnsi"/>
-                <w:sz w:val="24"/>
+                <w:szCs w:val="24"/>
+              </w:rPr>
+            </w:pPr>
+            <w:r>
+              <w:rPr>
                 <w:szCs w:val="24"/>
               </w:rPr>
               <w:t>Concreta estática</w:t>
@@ -2856,16 +3086,12 @@
           <w:p>
             <w:pPr>
               <w:rPr>
-                <w:rFonts w:asciiTheme="minorHAnsi" w:hAnsiTheme="minorHAnsi" w:cstheme="minorHAnsi"/>
-                <w:sz w:val="24"/>
                 <w:szCs w:val="24"/>
               </w:rPr>
             </w:pPr>
             <w:proofErr w:type="spellStart"/>
             <w:r>
               <w:rPr>
-                <w:rFonts w:asciiTheme="minorHAnsi" w:hAnsiTheme="minorHAnsi" w:cstheme="minorHAnsi"/>
-                <w:sz w:val="24"/>
                 <w:szCs w:val="24"/>
               </w:rPr>
               <w:t>AspectoValidacion</w:t>
@@ -2880,15 +3106,11 @@
           <w:p>
             <w:pPr>
               <w:rPr>
-                <w:rFonts w:asciiTheme="minorHAnsi" w:hAnsiTheme="minorHAnsi" w:cstheme="minorHAnsi"/>
-                <w:sz w:val="24"/>
-                <w:szCs w:val="24"/>
-              </w:rPr>
-            </w:pPr>
-            <w:r>
-              <w:rPr>
-                <w:rFonts w:asciiTheme="minorHAnsi" w:hAnsiTheme="minorHAnsi" w:cstheme="minorHAnsi"/>
-                <w:sz w:val="24"/>
+                <w:szCs w:val="24"/>
+              </w:rPr>
+            </w:pPr>
+            <w:r>
+              <w:rPr>
                 <w:szCs w:val="24"/>
               </w:rPr>
               <w:t>Cliente, Producto</w:t>
@@ -2902,15 +3124,11 @@
           <w:p>
             <w:pPr>
               <w:rPr>
-                <w:rFonts w:asciiTheme="minorHAnsi" w:hAnsiTheme="minorHAnsi" w:cstheme="minorHAnsi"/>
-                <w:sz w:val="24"/>
-                <w:szCs w:val="24"/>
-              </w:rPr>
-            </w:pPr>
-            <w:r>
-              <w:rPr>
-                <w:rFonts w:asciiTheme="minorHAnsi" w:hAnsiTheme="minorHAnsi" w:cstheme="minorHAnsi"/>
-                <w:sz w:val="24"/>
+                <w:szCs w:val="24"/>
+              </w:rPr>
+            </w:pPr>
+            <w:r>
+              <w:rPr>
                 <w:szCs w:val="24"/>
               </w:rPr>
               <w:t>Bajo (sin consumidores)</w:t>
@@ -2924,15 +3142,11 @@
           <w:p>
             <w:pPr>
               <w:rPr>
-                <w:rFonts w:asciiTheme="minorHAnsi" w:hAnsiTheme="minorHAnsi" w:cstheme="minorHAnsi"/>
-                <w:sz w:val="24"/>
-                <w:szCs w:val="24"/>
-              </w:rPr>
-            </w:pPr>
-            <w:r>
-              <w:rPr>
-                <w:rFonts w:asciiTheme="minorHAnsi" w:hAnsiTheme="minorHAnsi" w:cstheme="minorHAnsi"/>
-                <w:sz w:val="24"/>
+                <w:szCs w:val="24"/>
+              </w:rPr>
+            </w:pPr>
+            <w:r>
+              <w:rPr>
                 <w:szCs w:val="24"/>
               </w:rPr>
               <w:t>Concreta estática</w:t>
@@ -2948,16 +3162,12 @@
           <w:p>
             <w:pPr>
               <w:rPr>
-                <w:rFonts w:asciiTheme="minorHAnsi" w:hAnsiTheme="minorHAnsi" w:cstheme="minorHAnsi"/>
-                <w:sz w:val="24"/>
                 <w:szCs w:val="24"/>
               </w:rPr>
             </w:pPr>
             <w:proofErr w:type="spellStart"/>
             <w:r>
               <w:rPr>
-                <w:rFonts w:asciiTheme="minorHAnsi" w:hAnsiTheme="minorHAnsi" w:cstheme="minorHAnsi"/>
-                <w:sz w:val="24"/>
                 <w:szCs w:val="24"/>
               </w:rPr>
               <w:t>ProductoFactory</w:t>
@@ -2972,16 +3182,12 @@
           <w:p>
             <w:pPr>
               <w:rPr>
-                <w:rFonts w:asciiTheme="minorHAnsi" w:hAnsiTheme="minorHAnsi" w:cstheme="minorHAnsi"/>
-                <w:sz w:val="24"/>
                 <w:szCs w:val="24"/>
               </w:rPr>
             </w:pPr>
             <w:proofErr w:type="spellStart"/>
             <w:r>
               <w:rPr>
-                <w:rFonts w:asciiTheme="minorHAnsi" w:hAnsiTheme="minorHAnsi" w:cstheme="minorHAnsi"/>
-                <w:sz w:val="24"/>
                 <w:szCs w:val="24"/>
               </w:rPr>
               <w:t>MedicamentoCapsula</w:t>
@@ -2989,8 +3195,6 @@
             <w:proofErr w:type="spellEnd"/>
             <w:r>
               <w:rPr>
-                <w:rFonts w:asciiTheme="minorHAnsi" w:hAnsiTheme="minorHAnsi" w:cstheme="minorHAnsi"/>
-                <w:sz w:val="24"/>
                 <w:szCs w:val="24"/>
               </w:rPr>
               <w:t xml:space="preserve">, </w:t>
@@ -2998,8 +3202,6 @@
             <w:proofErr w:type="spellStart"/>
             <w:r>
               <w:rPr>
-                <w:rFonts w:asciiTheme="minorHAnsi" w:hAnsiTheme="minorHAnsi" w:cstheme="minorHAnsi"/>
-                <w:sz w:val="24"/>
                 <w:szCs w:val="24"/>
               </w:rPr>
               <w:t>MedicamentoLiquido</w:t>
@@ -3007,8 +3209,6 @@
             <w:proofErr w:type="spellEnd"/>
             <w:r>
               <w:rPr>
-                <w:rFonts w:asciiTheme="minorHAnsi" w:hAnsiTheme="minorHAnsi" w:cstheme="minorHAnsi"/>
-                <w:sz w:val="24"/>
                 <w:szCs w:val="24"/>
               </w:rPr>
               <w:t xml:space="preserve">, Laboratorio, </w:t>
@@ -3016,8 +3216,6 @@
             <w:proofErr w:type="spellStart"/>
             <w:r>
               <w:rPr>
-                <w:rFonts w:asciiTheme="minorHAnsi" w:hAnsiTheme="minorHAnsi" w:cstheme="minorHAnsi"/>
-                <w:sz w:val="24"/>
                 <w:szCs w:val="24"/>
               </w:rPr>
               <w:t>TipoRelleno</w:t>
@@ -3025,8 +3223,6 @@
             <w:proofErr w:type="spellEnd"/>
             <w:r>
               <w:rPr>
-                <w:rFonts w:asciiTheme="minorHAnsi" w:hAnsiTheme="minorHAnsi" w:cstheme="minorHAnsi"/>
-                <w:sz w:val="24"/>
                 <w:szCs w:val="24"/>
               </w:rPr>
               <w:t xml:space="preserve">, </w:t>
@@ -3034,8 +3230,6 @@
             <w:proofErr w:type="spellStart"/>
             <w:r>
               <w:rPr>
-                <w:rFonts w:asciiTheme="minorHAnsi" w:hAnsiTheme="minorHAnsi" w:cstheme="minorHAnsi"/>
-                <w:sz w:val="24"/>
                 <w:szCs w:val="24"/>
               </w:rPr>
               <w:t>MaterialEnvase</w:t>
@@ -3050,15 +3244,11 @@
           <w:p>
             <w:pPr>
               <w:rPr>
-                <w:rFonts w:asciiTheme="minorHAnsi" w:hAnsiTheme="minorHAnsi" w:cstheme="minorHAnsi"/>
-                <w:sz w:val="24"/>
-                <w:szCs w:val="24"/>
-              </w:rPr>
-            </w:pPr>
-            <w:r>
-              <w:rPr>
-                <w:rFonts w:asciiTheme="minorHAnsi" w:hAnsiTheme="minorHAnsi" w:cstheme="minorHAnsi"/>
-                <w:sz w:val="24"/>
+                <w:szCs w:val="24"/>
+              </w:rPr>
+            </w:pPr>
+            <w:r>
+              <w:rPr>
                 <w:szCs w:val="24"/>
               </w:rPr>
               <w:t>Bajo (sin consumidores)</w:t>
@@ -3072,15 +3262,11 @@
           <w:p>
             <w:pPr>
               <w:rPr>
-                <w:rFonts w:asciiTheme="minorHAnsi" w:hAnsiTheme="minorHAnsi" w:cstheme="minorHAnsi"/>
-                <w:sz w:val="24"/>
-                <w:szCs w:val="24"/>
-              </w:rPr>
-            </w:pPr>
-            <w:r>
-              <w:rPr>
-                <w:rFonts w:asciiTheme="minorHAnsi" w:hAnsiTheme="minorHAnsi" w:cstheme="minorHAnsi"/>
-                <w:sz w:val="24"/>
+                <w:szCs w:val="24"/>
+              </w:rPr>
+            </w:pPr>
+            <w:r>
+              <w:rPr>
                 <w:szCs w:val="24"/>
               </w:rPr>
               <w:t>Concreta estática</w:t>
@@ -3096,15 +3282,11 @@
           <w:p>
             <w:pPr>
               <w:rPr>
-                <w:rFonts w:asciiTheme="minorHAnsi" w:hAnsiTheme="minorHAnsi" w:cstheme="minorHAnsi"/>
-                <w:sz w:val="24"/>
-                <w:szCs w:val="24"/>
-              </w:rPr>
-            </w:pPr>
-            <w:r>
-              <w:rPr>
-                <w:rFonts w:asciiTheme="minorHAnsi" w:hAnsiTheme="minorHAnsi" w:cstheme="minorHAnsi"/>
-                <w:sz w:val="24"/>
+                <w:szCs w:val="24"/>
+              </w:rPr>
+            </w:pPr>
+            <w:r>
+              <w:rPr>
                 <w:szCs w:val="24"/>
               </w:rPr>
               <w:t>Evento* (4)</w:t>
@@ -3118,15 +3300,11 @@
           <w:p>
             <w:pPr>
               <w:rPr>
-                <w:rFonts w:asciiTheme="minorHAnsi" w:hAnsiTheme="minorHAnsi" w:cstheme="minorHAnsi"/>
-                <w:sz w:val="24"/>
-                <w:szCs w:val="24"/>
-              </w:rPr>
-            </w:pPr>
-            <w:r>
-              <w:rPr>
-                <w:rFonts w:asciiTheme="minorHAnsi" w:hAnsiTheme="minorHAnsi" w:cstheme="minorHAnsi"/>
-                <w:sz w:val="24"/>
+                <w:szCs w:val="24"/>
+              </w:rPr>
+            </w:pPr>
+            <w:r>
+              <w:rPr>
                 <w:szCs w:val="24"/>
               </w:rPr>
               <w:t xml:space="preserve">Producto (Stock/Vencimiento), </w:t>
@@ -3134,8 +3312,6 @@
             <w:proofErr w:type="spellStart"/>
             <w:r>
               <w:rPr>
-                <w:rFonts w:asciiTheme="minorHAnsi" w:hAnsiTheme="minorHAnsi" w:cstheme="minorHAnsi"/>
-                <w:sz w:val="24"/>
                 <w:szCs w:val="24"/>
               </w:rPr>
               <w:t>string</w:t>
@@ -3143,8 +3319,6 @@
             <w:proofErr w:type="spellEnd"/>
             <w:r>
               <w:rPr>
-                <w:rFonts w:asciiTheme="minorHAnsi" w:hAnsiTheme="minorHAnsi" w:cstheme="minorHAnsi"/>
-                <w:sz w:val="24"/>
                 <w:szCs w:val="24"/>
               </w:rPr>
               <w:t>/</w:t>
@@ -3152,8 +3326,6 @@
             <w:proofErr w:type="spellStart"/>
             <w:r>
               <w:rPr>
-                <w:rFonts w:asciiTheme="minorHAnsi" w:hAnsiTheme="minorHAnsi" w:cstheme="minorHAnsi"/>
-                <w:sz w:val="24"/>
                 <w:szCs w:val="24"/>
               </w:rPr>
               <w:t>int</w:t>
@@ -3168,15 +3340,11 @@
           <w:p>
             <w:pPr>
               <w:rPr>
-                <w:rFonts w:asciiTheme="minorHAnsi" w:hAnsiTheme="minorHAnsi" w:cstheme="minorHAnsi"/>
-                <w:sz w:val="24"/>
-                <w:szCs w:val="24"/>
-              </w:rPr>
-            </w:pPr>
-            <w:r>
-              <w:rPr>
-                <w:rFonts w:asciiTheme="minorHAnsi" w:hAnsiTheme="minorHAnsi" w:cstheme="minorHAnsi"/>
-                <w:sz w:val="24"/>
+                <w:szCs w:val="24"/>
+              </w:rPr>
+            </w:pPr>
+            <w:r>
+              <w:rPr>
                 <w:szCs w:val="24"/>
               </w:rPr>
               <w:t>Bajo (mecanismo de alerta)</w:t>
@@ -3190,15 +3358,11 @@
           <w:p>
             <w:pPr>
               <w:rPr>
-                <w:rFonts w:asciiTheme="minorHAnsi" w:hAnsiTheme="minorHAnsi" w:cstheme="minorHAnsi"/>
-                <w:sz w:val="24"/>
-                <w:szCs w:val="24"/>
-              </w:rPr>
-            </w:pPr>
-            <w:r>
-              <w:rPr>
-                <w:rFonts w:asciiTheme="minorHAnsi" w:hAnsiTheme="minorHAnsi" w:cstheme="minorHAnsi"/>
-                <w:sz w:val="24"/>
+                <w:szCs w:val="24"/>
+              </w:rPr>
+            </w:pPr>
+            <w:r>
+              <w:rPr>
                 <w:szCs w:val="24"/>
               </w:rPr>
               <w:t>Concreta</w:t>
@@ -3214,18 +3378,13 @@
           <w:p>
             <w:pPr>
               <w:rPr>
-                <w:rFonts w:asciiTheme="minorHAnsi" w:hAnsiTheme="minorHAnsi" w:cstheme="minorHAnsi"/>
-                <w:sz w:val="24"/>
-                <w:szCs w:val="24"/>
-              </w:rPr>
-            </w:pPr>
-            <w:r>
-              <w:rPr>
-                <w:rFonts w:asciiTheme="minorHAnsi" w:hAnsiTheme="minorHAnsi" w:cstheme="minorHAnsi"/>
-                <w:sz w:val="24"/>
-                <w:szCs w:val="24"/>
-              </w:rPr>
-              <w:lastRenderedPageBreak/>
+                <w:szCs w:val="24"/>
+              </w:rPr>
+            </w:pPr>
+            <w:r>
+              <w:rPr>
+                <w:szCs w:val="24"/>
+              </w:rPr>
               <w:t>Clases de dominio</w:t>
             </w:r>
           </w:p>
@@ -3237,15 +3396,11 @@
           <w:p>
             <w:pPr>
               <w:rPr>
-                <w:rFonts w:asciiTheme="minorHAnsi" w:hAnsiTheme="minorHAnsi" w:cstheme="minorHAnsi"/>
-                <w:sz w:val="24"/>
-                <w:szCs w:val="24"/>
-              </w:rPr>
-            </w:pPr>
-            <w:r>
-              <w:rPr>
-                <w:rFonts w:asciiTheme="minorHAnsi" w:hAnsiTheme="minorHAnsi" w:cstheme="minorHAnsi"/>
-                <w:sz w:val="24"/>
+                <w:szCs w:val="24"/>
+              </w:rPr>
+            </w:pPr>
+            <w:r>
+              <w:rPr>
                 <w:szCs w:val="24"/>
               </w:rPr>
               <w:t>entre sí (herencia R01-R05, composición R08-R09)</w:t>
@@ -3259,15 +3414,11 @@
           <w:p>
             <w:pPr>
               <w:rPr>
-                <w:rFonts w:asciiTheme="minorHAnsi" w:hAnsiTheme="minorHAnsi" w:cstheme="minorHAnsi"/>
-                <w:sz w:val="24"/>
-                <w:szCs w:val="24"/>
-              </w:rPr>
-            </w:pPr>
-            <w:r>
-              <w:rPr>
-                <w:rFonts w:asciiTheme="minorHAnsi" w:hAnsiTheme="minorHAnsi" w:cstheme="minorHAnsi"/>
-                <w:sz w:val="24"/>
+                <w:szCs w:val="24"/>
+              </w:rPr>
+            </w:pPr>
+            <w:r>
+              <w:rPr>
                 <w:szCs w:val="24"/>
               </w:rPr>
               <w:t>Alto (modelo del negocio)</w:t>
@@ -3281,15 +3432,11 @@
           <w:p>
             <w:pPr>
               <w:rPr>
-                <w:rFonts w:asciiTheme="minorHAnsi" w:hAnsiTheme="minorHAnsi" w:cstheme="minorHAnsi"/>
-                <w:sz w:val="24"/>
-                <w:szCs w:val="24"/>
-              </w:rPr>
-            </w:pPr>
-            <w:r>
-              <w:rPr>
-                <w:rFonts w:asciiTheme="minorHAnsi" w:hAnsiTheme="minorHAnsi" w:cstheme="minorHAnsi"/>
-                <w:sz w:val="24"/>
+                <w:szCs w:val="24"/>
+              </w:rPr>
+            </w:pPr>
+            <w:r>
+              <w:rPr>
                 <w:szCs w:val="24"/>
               </w:rPr>
               <w:t>Concreta</w:t>
@@ -3301,40 +3448,34 @@
     <w:p/>
     <w:p/>
     <w:p/>
-    <w:p>
-      <w:pPr>
-        <w:spacing w:before="240" w:after="120" w:line="480" w:lineRule="auto"/>
-        <w:rPr>
-          <w:rFonts w:asciiTheme="minorHAnsi" w:hAnsiTheme="minorHAnsi" w:cstheme="minorHAnsi"/>
+    <w:p/>
+    <w:p/>
+    <w:p>
+      <w:pPr>
+        <w:spacing w:before="240"/>
+        <w:rPr>
           <w:b/>
-          <w:sz w:val="24"/>
           <w:szCs w:val="24"/>
         </w:rPr>
       </w:pPr>
       <w:r>
         <w:rPr>
-          <w:rFonts w:asciiTheme="minorHAnsi" w:hAnsiTheme="minorHAnsi" w:cstheme="minorHAnsi"/>
           <w:b/>
-          <w:sz w:val="24"/>
           <w:szCs w:val="24"/>
         </w:rPr>
+        <w:lastRenderedPageBreak/>
         <w:t>Alto nivel vs. bajo nivel</w:t>
       </w:r>
     </w:p>
     <w:p>
       <w:pPr>
-        <w:spacing w:line="480" w:lineRule="auto"/>
         <w:ind w:firstLine="720"/>
         <w:rPr>
-          <w:rFonts w:asciiTheme="minorHAnsi" w:hAnsiTheme="minorHAnsi" w:cstheme="minorHAnsi"/>
-          <w:sz w:val="24"/>
           <w:szCs w:val="24"/>
         </w:rPr>
       </w:pPr>
       <w:r>
         <w:rPr>
-          <w:rFonts w:asciiTheme="minorHAnsi" w:hAnsiTheme="minorHAnsi" w:cstheme="minorHAnsi"/>
-          <w:sz w:val="24"/>
           <w:szCs w:val="24"/>
         </w:rPr>
         <w:t xml:space="preserve">• Alto nivel (reglas del negocio): </w:t>
@@ -3342,8 +3483,6 @@
       <w:proofErr w:type="spellStart"/>
       <w:r>
         <w:rPr>
-          <w:rFonts w:asciiTheme="minorHAnsi" w:hAnsiTheme="minorHAnsi" w:cstheme="minorHAnsi"/>
-          <w:sz w:val="24"/>
           <w:szCs w:val="24"/>
         </w:rPr>
         <w:t>ServicioProducto</w:t>
@@ -3351,8 +3490,6 @@
       <w:proofErr w:type="spellEnd"/>
       <w:r>
         <w:rPr>
-          <w:rFonts w:asciiTheme="minorHAnsi" w:hAnsiTheme="minorHAnsi" w:cstheme="minorHAnsi"/>
-          <w:sz w:val="24"/>
           <w:szCs w:val="24"/>
         </w:rPr>
         <w:t xml:space="preserve">, </w:t>
@@ -3360,8 +3497,6 @@
       <w:proofErr w:type="spellStart"/>
       <w:r>
         <w:rPr>
-          <w:rFonts w:asciiTheme="minorHAnsi" w:hAnsiTheme="minorHAnsi" w:cstheme="minorHAnsi"/>
-          <w:sz w:val="24"/>
           <w:szCs w:val="24"/>
         </w:rPr>
         <w:t>ServicioCliente</w:t>
@@ -3369,8 +3504,6 @@
       <w:proofErr w:type="spellEnd"/>
       <w:r>
         <w:rPr>
-          <w:rFonts w:asciiTheme="minorHAnsi" w:hAnsiTheme="minorHAnsi" w:cstheme="minorHAnsi"/>
-          <w:sz w:val="24"/>
           <w:szCs w:val="24"/>
         </w:rPr>
         <w:t xml:space="preserve">, </w:t>
@@ -3378,8 +3511,6 @@
       <w:proofErr w:type="spellStart"/>
       <w:r>
         <w:rPr>
-          <w:rFonts w:asciiTheme="minorHAnsi" w:hAnsiTheme="minorHAnsi" w:cstheme="minorHAnsi"/>
-          <w:sz w:val="24"/>
           <w:szCs w:val="24"/>
         </w:rPr>
         <w:t>ServicioUsuario</w:t>
@@ -3387,8 +3518,6 @@
       <w:proofErr w:type="spellEnd"/>
       <w:r>
         <w:rPr>
-          <w:rFonts w:asciiTheme="minorHAnsi" w:hAnsiTheme="minorHAnsi" w:cstheme="minorHAnsi"/>
-          <w:sz w:val="24"/>
           <w:szCs w:val="24"/>
         </w:rPr>
         <w:t xml:space="preserve">, </w:t>
@@ -3396,8 +3525,6 @@
       <w:proofErr w:type="spellStart"/>
       <w:r>
         <w:rPr>
-          <w:rFonts w:asciiTheme="minorHAnsi" w:hAnsiTheme="minorHAnsi" w:cstheme="minorHAnsi"/>
-          <w:sz w:val="24"/>
           <w:szCs w:val="24"/>
         </w:rPr>
         <w:t>ServicioMovimiento</w:t>
@@ -3405,8 +3532,6 @@
       <w:proofErr w:type="spellEnd"/>
       <w:r>
         <w:rPr>
-          <w:rFonts w:asciiTheme="minorHAnsi" w:hAnsiTheme="minorHAnsi" w:cstheme="minorHAnsi"/>
-          <w:sz w:val="24"/>
           <w:szCs w:val="24"/>
         </w:rPr>
         <w:t xml:space="preserve"> y el modelo de dominio (Producto, Medicamento, Movimiento, Cliente...). Son las que implementan qué vende la farmacia, stock mínimo, vencimiento, puntos, ventas.</w:t>
@@ -3414,18 +3539,13 @@
     </w:p>
     <w:p>
       <w:pPr>
-        <w:spacing w:line="480" w:lineRule="auto"/>
         <w:ind w:firstLine="720"/>
         <w:rPr>
-          <w:rFonts w:asciiTheme="minorHAnsi" w:hAnsiTheme="minorHAnsi" w:cstheme="minorHAnsi"/>
-          <w:sz w:val="24"/>
           <w:szCs w:val="24"/>
         </w:rPr>
       </w:pPr>
       <w:r>
         <w:rPr>
-          <w:rFonts w:asciiTheme="minorHAnsi" w:hAnsiTheme="minorHAnsi" w:cstheme="minorHAnsi"/>
-          <w:sz w:val="24"/>
           <w:szCs w:val="24"/>
         </w:rPr>
         <w:t>• Bajo nivel (detalles técnicos): acceso a archivos (</w:t>
@@ -3433,8 +3553,6 @@
       <w:proofErr w:type="spellStart"/>
       <w:r>
         <w:rPr>
-          <w:rFonts w:asciiTheme="minorHAnsi" w:hAnsiTheme="minorHAnsi" w:cstheme="minorHAnsi"/>
-          <w:sz w:val="24"/>
           <w:szCs w:val="24"/>
         </w:rPr>
         <w:t>File.ReadAllLines</w:t>
@@ -3442,8 +3560,6 @@
       <w:proofErr w:type="spellEnd"/>
       <w:r>
         <w:rPr>
-          <w:rFonts w:asciiTheme="minorHAnsi" w:hAnsiTheme="minorHAnsi" w:cstheme="minorHAnsi"/>
-          <w:sz w:val="24"/>
           <w:szCs w:val="24"/>
         </w:rPr>
         <w:t xml:space="preserve">), </w:t>
@@ -3451,8 +3567,6 @@
       <w:proofErr w:type="spellStart"/>
       <w:r>
         <w:rPr>
-          <w:rFonts w:asciiTheme="minorHAnsi" w:hAnsiTheme="minorHAnsi" w:cstheme="minorHAnsi"/>
-          <w:sz w:val="24"/>
           <w:szCs w:val="24"/>
         </w:rPr>
         <w:t>Console</w:t>
@@ -3460,8 +3574,6 @@
       <w:proofErr w:type="spellEnd"/>
       <w:r>
         <w:rPr>
-          <w:rFonts w:asciiTheme="minorHAnsi" w:hAnsiTheme="minorHAnsi" w:cstheme="minorHAnsi"/>
-          <w:sz w:val="24"/>
           <w:szCs w:val="24"/>
         </w:rPr>
         <w:t xml:space="preserve"> (presentación), </w:t>
@@ -3469,8 +3581,6 @@
       <w:proofErr w:type="spellStart"/>
       <w:r>
         <w:rPr>
-          <w:rFonts w:asciiTheme="minorHAnsi" w:hAnsiTheme="minorHAnsi" w:cstheme="minorHAnsi"/>
-          <w:sz w:val="24"/>
           <w:szCs w:val="24"/>
         </w:rPr>
         <w:t>AspectoAutenticacion</w:t>
@@ -3478,8 +3588,6 @@
       <w:proofErr w:type="spellEnd"/>
       <w:r>
         <w:rPr>
-          <w:rFonts w:asciiTheme="minorHAnsi" w:hAnsiTheme="minorHAnsi" w:cstheme="minorHAnsi"/>
-          <w:sz w:val="24"/>
           <w:szCs w:val="24"/>
         </w:rPr>
         <w:t>/</w:t>
@@ -3487,8 +3595,6 @@
       <w:proofErr w:type="spellStart"/>
       <w:r>
         <w:rPr>
-          <w:rFonts w:asciiTheme="minorHAnsi" w:hAnsiTheme="minorHAnsi" w:cstheme="minorHAnsi"/>
-          <w:sz w:val="24"/>
           <w:szCs w:val="24"/>
         </w:rPr>
         <w:t>AspectoValidacion</w:t>
@@ -3496,8 +3602,6 @@
       <w:proofErr w:type="spellEnd"/>
       <w:r>
         <w:rPr>
-          <w:rFonts w:asciiTheme="minorHAnsi" w:hAnsiTheme="minorHAnsi" w:cstheme="minorHAnsi"/>
-          <w:sz w:val="24"/>
           <w:szCs w:val="24"/>
         </w:rPr>
         <w:t xml:space="preserve"> (validaciones), </w:t>
@@ -3505,8 +3609,6 @@
       <w:proofErr w:type="spellStart"/>
       <w:r>
         <w:rPr>
-          <w:rFonts w:asciiTheme="minorHAnsi" w:hAnsiTheme="minorHAnsi" w:cstheme="minorHAnsi"/>
-          <w:sz w:val="24"/>
           <w:szCs w:val="24"/>
         </w:rPr>
         <w:t>ProductoFactory</w:t>
@@ -3514,8 +3616,6 @@
       <w:proofErr w:type="spellEnd"/>
       <w:r>
         <w:rPr>
-          <w:rFonts w:asciiTheme="minorHAnsi" w:hAnsiTheme="minorHAnsi" w:cstheme="minorHAnsi"/>
-          <w:sz w:val="24"/>
           <w:szCs w:val="24"/>
         </w:rPr>
         <w:t>, los Evento* como mecanismo de alerta.</w:t>
@@ -3523,18 +3623,13 @@
     </w:p>
     <w:p>
       <w:pPr>
-        <w:spacing w:line="480" w:lineRule="auto"/>
         <w:ind w:firstLine="720"/>
         <w:rPr>
-          <w:rFonts w:asciiTheme="minorHAnsi" w:hAnsiTheme="minorHAnsi" w:cstheme="minorHAnsi"/>
-          <w:sz w:val="24"/>
           <w:szCs w:val="24"/>
         </w:rPr>
       </w:pPr>
       <w:r>
         <w:rPr>
-          <w:rFonts w:asciiTheme="minorHAnsi" w:hAnsiTheme="minorHAnsi" w:cstheme="minorHAnsi"/>
-          <w:sz w:val="24"/>
           <w:szCs w:val="24"/>
         </w:rPr>
         <w:t xml:space="preserve">• Neutros / aislados: </w:t>
@@ -3542,8 +3637,6 @@
       <w:proofErr w:type="spellStart"/>
       <w:r>
         <w:rPr>
-          <w:rFonts w:asciiTheme="minorHAnsi" w:hAnsiTheme="minorHAnsi" w:cstheme="minorHAnsi"/>
-          <w:sz w:val="24"/>
           <w:szCs w:val="24"/>
         </w:rPr>
         <w:t>ServicioDescuento</w:t>
@@ -3551,8 +3644,6 @@
       <w:proofErr w:type="spellEnd"/>
       <w:r>
         <w:rPr>
-          <w:rFonts w:asciiTheme="minorHAnsi" w:hAnsiTheme="minorHAnsi" w:cstheme="minorHAnsi"/>
-          <w:sz w:val="24"/>
           <w:szCs w:val="24"/>
         </w:rPr>
         <w:t xml:space="preserve">, </w:t>
@@ -3560,8 +3651,6 @@
       <w:proofErr w:type="spellStart"/>
       <w:r>
         <w:rPr>
-          <w:rFonts w:asciiTheme="minorHAnsi" w:hAnsiTheme="minorHAnsi" w:cstheme="minorHAnsi"/>
-          <w:sz w:val="24"/>
           <w:szCs w:val="24"/>
         </w:rPr>
         <w:t>ServicioNotificacion</w:t>
@@ -3569,22 +3658,117 @@
       <w:proofErr w:type="spellEnd"/>
       <w:r>
         <w:rPr>
-          <w:rFonts w:asciiTheme="minorHAnsi" w:hAnsiTheme="minorHAnsi" w:cstheme="minorHAnsi"/>
-          <w:sz w:val="24"/>
           <w:szCs w:val="24"/>
         </w:rPr>
-        <w:t xml:space="preserve"> y sus interfaces no se conectan con nadie (H-05).</w:t>
+        <w:t xml:space="preserve"> y sus interfaces no se conectan con nadie (sin hallazgo propio en la tabla; ver mapa de dependencias: sin consumidores).</w:t>
+      </w:r>
+    </w:p>
+    <w:p>
+      <w:pPr>
+        <w:rPr>
+          <w:szCs w:val="24"/>
+        </w:rPr>
+      </w:pPr>
+    </w:p>
+    <w:p>
+      <w:r>
+        <w:rPr>
+          <w:b/>
+        </w:rPr>
+        <w:t>Donde se invierte la relacion hoy (DIP):</w:t>
+      </w:r>
+    </w:p>
+    <w:p>
+      <w:pPr>
+        <w:ind w:firstLine="720"/>
+      </w:pPr>
+      <w:r>
+        <w:t>Los modulos de alto nivel (servicios) dependen directamente de detalles de bajo nivel: File.ReadAllLines, rutas fisicas, Console y clases concretas (new MedicamentoCapsula, File). No hay abstraccion entre la regla de negocio y el detalle tecnico.</w:t>
+      </w:r>
+    </w:p>
+    <w:p>
+      <w:pPr>
+        <w:ind w:firstLine="720"/>
+      </w:pPr>
+      <w:r>
+        <w:t>Program actua como composition root implicito: conoce, crea y cablea todos los servicios y la regla de venta (Program.cs, lineas 255-303).</w:t>
+      </w:r>
+    </w:p>
+    <w:p>
+      <w:pPr>
+        <w:ind w:firstLine="720"/>
+      </w:pPr>
+      <w:r>
+        <w:t>Las unicas abstracciones del sistema (IDescuento, IServicioNotificacion) estan invertidas a favor de clases sin consumidores (no tienen hallazgo propio en la tabla; ver mapa de dependencias): la interfaz existe pero nadie depende de ella en el flujo real.</w:t>
+      </w:r>
+    </w:p>
+    <w:p>
+      <w:pPr>
+        <w:ind w:firstLine="720"/>
+      </w:pPr>
+      <w:r>
+        <w:t>Resultado: la piramide de dependencias esta invertida - el detalle tecnico (archivo/consola) dicta el diseno, no la regla de negocio.</w:t>
       </w:r>
     </w:p>
     <w:p/>
     <w:sectPr>
-      <w:pgSz w:w="15840" w:h="12240" w:orient="landscape"/>
-      <w:pgMar w:top="850" w:right="850" w:bottom="850" w:left="850" w:header="708" w:footer="708" w:gutter="0"/>
+      <w:pgSz w:w="12240" w:h="15840"/>
+      <w:pgMar w:top="1440" w:right="1440" w:bottom="1440" w:left="1440" w:header="720" w:footer="720" w:gutter="0"/>
       <w:cols w:space="708"/>
       <w:docGrid w:linePitch="360"/>
     </w:sectPr>
   </w:body>
 </w:document>
+</file>
+
+<file path=word/endnotes.xml><?xml version="1.0" encoding="utf-8"?>
+<w:endnotes xmlns:wpc="http://schemas.microsoft.com/office/word/2010/wordprocessingCanvas" xmlns:cx="http://schemas.microsoft.com/office/drawing/2014/chartex" xmlns:cx1="http://schemas.microsoft.com/office/drawing/2015/9/8/chartex" xmlns:cx2="http://schemas.microsoft.com/office/drawing/2015/10/21/chartex" xmlns:cx3="http://schemas.microsoft.com/office/drawing/2016/5/9/chartex" xmlns:cx4="http://schemas.microsoft.com/office/drawing/2016/5/10/chartex" xmlns:cx5="http://schemas.microsoft.com/office/drawing/2016/5/11/chartex" xmlns:cx6="http://schemas.microsoft.com/office/drawing/2016/5/12/chartex" xmlns:cx7="http://schemas.microsoft.com/office/drawing/2016/5/13/chartex" xmlns:cx8="http://schemas.microsoft.com/office/drawing/2016/5/14/chartex" xmlns:mc="http://schemas.openxmlformats.org/markup-compatibility/2006" xmlns:aink="http://schemas.microsoft.com/office/drawing/2016/ink" xmlns:am3d="http://schemas.microsoft.com/office/drawing/2017/model3d" xmlns:o="urn:schemas-microsoft-com:office:office" xmlns:r="http://schemas.openxmlformats.org/officeDocument/2006/relationships" xmlns:m="http://schemas.openxmlformats.org/officeDocument/2006/math" xmlns:v="urn:schemas-microsoft-com:vml" xmlns:wp14="http://schemas.microsoft.com/office/word/2010/wordprocessingDrawing" xmlns:wp="http://schemas.openxmlformats.org/drawingml/2006/wordprocessingDrawing" xmlns:w10="urn:schemas-microsoft-com:office:word" xmlns:w="http://schemas.openxmlformats.org/wordprocessingml/2006/main" xmlns:w14="http://schemas.microsoft.com/office/word/2010/wordml" xmlns:w15="http://schemas.microsoft.com/office/word/2012/wordml" xmlns:w16cex="http://schemas.microsoft.com/office/word/2018/wordml/cex" xmlns:w16cid="http://schemas.microsoft.com/office/word/2016/wordml/cid" xmlns:w16="http://schemas.microsoft.com/office/word/2018/wordml" xmlns:w16sdtdh="http://schemas.microsoft.com/office/word/2020/wordml/sdtdatahash" xmlns:w16se="http://schemas.microsoft.com/office/word/2015/wordml/symex" xmlns:wpg="http://schemas.microsoft.com/office/word/2010/wordprocessingGroup" xmlns:wpi="http://schemas.microsoft.com/office/word/2010/wordprocessingInk" xmlns:wne="http://schemas.microsoft.com/office/word/2006/wordml" xmlns:wps="http://schemas.microsoft.com/office/word/2010/wordprocessingShape" mc:Ignorable="w14 w15 w16se w16cid w16 w16cex w16sdtdh wp14">
+  <w:endnote w:type="separator" w:id="-1">
+    <w:p>
+      <w:pPr>
+        <w:spacing w:line="240" w:lineRule="auto"/>
+      </w:pPr>
+      <w:r>
+        <w:separator/>
+      </w:r>
+    </w:p>
+  </w:endnote>
+  <w:endnote w:type="continuationSeparator" w:id="0">
+    <w:p>
+      <w:pPr>
+        <w:spacing w:line="240" w:lineRule="auto"/>
+      </w:pPr>
+      <w:r>
+        <w:continuationSeparator/>
+      </w:r>
+    </w:p>
+  </w:endnote>
+</w:endnotes>
+</file>
+
+<file path=word/footnotes.xml><?xml version="1.0" encoding="utf-8"?>
+<w:footnotes xmlns:wpc="http://schemas.microsoft.com/office/word/2010/wordprocessingCanvas" xmlns:cx="http://schemas.microsoft.com/office/drawing/2014/chartex" xmlns:cx1="http://schemas.microsoft.com/office/drawing/2015/9/8/chartex" xmlns:cx2="http://schemas.microsoft.com/office/drawing/2015/10/21/chartex" xmlns:cx3="http://schemas.microsoft.com/office/drawing/2016/5/9/chartex" xmlns:cx4="http://schemas.microsoft.com/office/drawing/2016/5/10/chartex" xmlns:cx5="http://schemas.microsoft.com/office/drawing/2016/5/11/chartex" xmlns:cx6="http://schemas.microsoft.com/office/drawing/2016/5/12/chartex" xmlns:cx7="http://schemas.microsoft.com/office/drawing/2016/5/13/chartex" xmlns:cx8="http://schemas.microsoft.com/office/drawing/2016/5/14/chartex" xmlns:mc="http://schemas.openxmlformats.org/markup-compatibility/2006" xmlns:aink="http://schemas.microsoft.com/office/drawing/2016/ink" xmlns:am3d="http://schemas.microsoft.com/office/drawing/2017/model3d" xmlns:o="urn:schemas-microsoft-com:office:office" xmlns:r="http://schemas.openxmlformats.org/officeDocument/2006/relationships" xmlns:m="http://schemas.openxmlformats.org/officeDocument/2006/math" xmlns:v="urn:schemas-microsoft-com:vml" xmlns:wp14="http://schemas.microsoft.com/office/word/2010/wordprocessingDrawing" xmlns:wp="http://schemas.openxmlformats.org/drawingml/2006/wordprocessingDrawing" xmlns:w10="urn:schemas-microsoft-com:office:word" xmlns:w="http://schemas.openxmlformats.org/wordprocessingml/2006/main" xmlns:w14="http://schemas.microsoft.com/office/word/2010/wordml" xmlns:w15="http://schemas.microsoft.com/office/word/2012/wordml" xmlns:w16cex="http://schemas.microsoft.com/office/word/2018/wordml/cex" xmlns:w16cid="http://schemas.microsoft.com/office/word/2016/wordml/cid" xmlns:w16="http://schemas.microsoft.com/office/word/2018/wordml" xmlns:w16sdtdh="http://schemas.microsoft.com/office/word/2020/wordml/sdtdatahash" xmlns:w16se="http://schemas.microsoft.com/office/word/2015/wordml/symex" xmlns:wpg="http://schemas.microsoft.com/office/word/2010/wordprocessingGroup" xmlns:wpi="http://schemas.microsoft.com/office/word/2010/wordprocessingInk" xmlns:wne="http://schemas.microsoft.com/office/word/2006/wordml" xmlns:wps="http://schemas.microsoft.com/office/word/2010/wordprocessingShape" mc:Ignorable="w14 w15 w16se w16cid w16 w16cex w16sdtdh wp14">
+  <w:footnote w:type="separator" w:id="-1">
+    <w:p>
+      <w:pPr>
+        <w:spacing w:line="240" w:lineRule="auto"/>
+      </w:pPr>
+      <w:r>
+        <w:separator/>
+      </w:r>
+    </w:p>
+  </w:footnote>
+  <w:footnote w:type="continuationSeparator" w:id="0">
+    <w:p>
+      <w:pPr>
+        <w:spacing w:line="240" w:lineRule="auto"/>
+      </w:pPr>
+      <w:r>
+        <w:continuationSeparator/>
+      </w:r>
+    </w:p>
+  </w:footnote>
+</w:footnotes>
 </file>
 
 <file path=word/numbering.xml><?xml version="1.0" encoding="utf-8"?>
@@ -5151,8 +5335,12 @@
   <w:style w:type="paragraph" w:default="1" w:styleId="Normal">
     <w:name w:val="Normal"/>
     <w:qFormat/>
+    <w:pPr>
+      <w:spacing w:after="0" w:line="480" w:lineRule="auto"/>
+    </w:pPr>
     <w:rPr>
-      <w:rFonts w:ascii="Calibri" w:eastAsia="Calibri" w:hAnsi="Calibri" w:cs="Calibri"/>
+      <w:rFonts w:ascii="Times New Roman" w:eastAsia="Calibri" w:hAnsi="Times New Roman" w:cs="Times New Roman"/>
+      <w:sz w:val="24"/>
     </w:rPr>
   </w:style>
   <w:style w:type="character" w:default="1" w:styleId="Fuentedeprrafopredeter">
@@ -5204,6 +5392,58 @@
       <w:rFonts w:ascii="Calibri" w:eastAsia="Calibri" w:hAnsi="Calibri" w:cs="Calibri"/>
       <w:sz w:val="22"/>
       <w:szCs w:val="22"/>
+    </w:rPr>
+  </w:style>
+  <w:style w:type="paragraph" w:styleId="Encabezado">
+    <w:name w:val="header"/>
+    <w:basedOn w:val="Normal"/>
+    <w:link w:val="EncabezadoCar"/>
+    <w:uiPriority w:val="99"/>
+    <w:unhideWhenUsed/>
+    <w:rsid w:val="005E4451"/>
+    <w:pPr>
+      <w:tabs>
+        <w:tab w:val="center" w:pos="4419"/>
+        <w:tab w:val="right" w:pos="8838"/>
+      </w:tabs>
+      <w:spacing w:line="240" w:lineRule="auto"/>
+    </w:pPr>
+  </w:style>
+  <w:style w:type="character" w:customStyle="1" w:styleId="EncabezadoCar">
+    <w:name w:val="Encabezado Car"/>
+    <w:basedOn w:val="Fuentedeprrafopredeter"/>
+    <w:link w:val="Encabezado"/>
+    <w:uiPriority w:val="99"/>
+    <w:rsid w:val="005E4451"/>
+    <w:rPr>
+      <w:rFonts w:ascii="Times New Roman" w:eastAsia="Calibri" w:hAnsi="Times New Roman" w:cs="Times New Roman"/>
+      <w:sz w:val="24"/>
+    </w:rPr>
+  </w:style>
+  <w:style w:type="paragraph" w:styleId="Piedepgina">
+    <w:name w:val="footer"/>
+    <w:basedOn w:val="Normal"/>
+    <w:link w:val="PiedepginaCar"/>
+    <w:uiPriority w:val="99"/>
+    <w:unhideWhenUsed/>
+    <w:rsid w:val="005E4451"/>
+    <w:pPr>
+      <w:tabs>
+        <w:tab w:val="center" w:pos="4419"/>
+        <w:tab w:val="right" w:pos="8838"/>
+      </w:tabs>
+      <w:spacing w:line="240" w:lineRule="auto"/>
+    </w:pPr>
+  </w:style>
+  <w:style w:type="character" w:customStyle="1" w:styleId="PiedepginaCar">
+    <w:name w:val="Pie de página Car"/>
+    <w:basedOn w:val="Fuentedeprrafopredeter"/>
+    <w:link w:val="Piedepgina"/>
+    <w:uiPriority w:val="99"/>
+    <w:rsid w:val="005E4451"/>
+    <w:rPr>
+      <w:rFonts w:ascii="Times New Roman" w:eastAsia="Calibri" w:hAnsi="Times New Roman" w:cs="Times New Roman"/>
+      <w:sz w:val="24"/>
     </w:rPr>
   </w:style>
 </w:styles>

</xml_diff>